<commit_message>
docs: fix Word output layout, figure references and GER-029
Word layout: md_to_docx gives every table column at least the width of
its longest word (capped at 12 characters), so IDs like GER-001 and
priority words like Zorunlu/(Yüksek) no longer break mid-word in the
requirements report tables. Long code paths may still wrap.

SDD: Figures 1, 5 and 4c are now referenced in the text, and §1.5 says
that figures are numbered by diagram type (matching docs/diagrams/), so
Figure 5 appearing before 3d is intended.

Requirements report GER-029: the shutdown-wait tests on the analysis
and mutation pages were missing; only the RL and batch pages have no
such test.

Both .docx files rebuilt from the Markdown. No code or test file is
changed.

Co-Authored-By: Claude Opus 5.5 <noreply@anthropic.com>
</commit_message>
<xml_diff>
--- a/docs/TestZede-Gereksinim-Raporu-v2.docx
+++ b/docs/TestZede-Gereksinim-Raporu-v2.docx
@@ -936,16 +936,16 @@
         <w:tblLayout w:type="fixed"/>
       </w:tblPr>
       <w:tblGrid>
-        <w:gridCol w:w="666"/>
-        <w:gridCol w:w="3027"/>
-        <w:gridCol w:w="901"/>
-        <w:gridCol w:w="1405"/>
-        <w:gridCol w:w="3027"/>
+        <w:gridCol w:w="909"/>
+        <w:gridCol w:w="2803"/>
+        <w:gridCol w:w="1107"/>
+        <w:gridCol w:w="1404"/>
+        <w:gridCol w:w="2803"/>
       </w:tblGrid>
       <w:tr>
         <w:tc>
           <w:tcPr>
-            <w:tcW w:type="dxa" w:w="666"/>
+            <w:tcW w:type="dxa" w:w="909"/>
             <w:tcBorders>
               <w:top w:val="single" w:sz="4" w:space="0" w:color="8C8C8C"/>
               <w:left w:val="single" w:sz="4" w:space="0" w:color="8C8C8C"/>
@@ -975,7 +975,7 @@
         </w:tc>
         <w:tc>
           <w:tcPr>
-            <w:tcW w:type="dxa" w:w="3027"/>
+            <w:tcW w:type="dxa" w:w="2803"/>
             <w:tcBorders>
               <w:top w:val="single" w:sz="4" w:space="0" w:color="8C8C8C"/>
               <w:left w:val="single" w:sz="4" w:space="0" w:color="8C8C8C"/>
@@ -1005,7 +1005,7 @@
         </w:tc>
         <w:tc>
           <w:tcPr>
-            <w:tcW w:type="dxa" w:w="901"/>
+            <w:tcW w:type="dxa" w:w="1107"/>
             <w:tcBorders>
               <w:top w:val="single" w:sz="4" w:space="0" w:color="8C8C8C"/>
               <w:left w:val="single" w:sz="4" w:space="0" w:color="8C8C8C"/>
@@ -1035,7 +1035,7 @@
         </w:tc>
         <w:tc>
           <w:tcPr>
-            <w:tcW w:type="dxa" w:w="1405"/>
+            <w:tcW w:type="dxa" w:w="1404"/>
             <w:tcBorders>
               <w:top w:val="single" w:sz="4" w:space="0" w:color="8C8C8C"/>
               <w:left w:val="single" w:sz="4" w:space="0" w:color="8C8C8C"/>
@@ -1065,7 +1065,7 @@
         </w:tc>
         <w:tc>
           <w:tcPr>
-            <w:tcW w:type="dxa" w:w="3027"/>
+            <w:tcW w:type="dxa" w:w="2803"/>
             <w:tcBorders>
               <w:top w:val="single" w:sz="4" w:space="0" w:color="8C8C8C"/>
               <w:left w:val="single" w:sz="4" w:space="0" w:color="8C8C8C"/>
@@ -1097,7 +1097,7 @@
       <w:tr>
         <w:tc>
           <w:tcPr>
-            <w:tcW w:type="dxa" w:w="666"/>
+            <w:tcW w:type="dxa" w:w="909"/>
             <w:tcBorders>
               <w:top w:val="single" w:sz="4" w:space="0" w:color="8C8C8C"/>
               <w:left w:val="single" w:sz="4" w:space="0" w:color="8C8C8C"/>
@@ -1125,7 +1125,7 @@
         </w:tc>
         <w:tc>
           <w:tcPr>
-            <w:tcW w:type="dxa" w:w="3027"/>
+            <w:tcW w:type="dxa" w:w="2803"/>
             <w:tcBorders>
               <w:top w:val="single" w:sz="4" w:space="0" w:color="8C8C8C"/>
               <w:left w:val="single" w:sz="4" w:space="0" w:color="8C8C8C"/>
@@ -1153,7 +1153,7 @@
         </w:tc>
         <w:tc>
           <w:tcPr>
-            <w:tcW w:type="dxa" w:w="901"/>
+            <w:tcW w:type="dxa" w:w="1107"/>
             <w:tcBorders>
               <w:top w:val="single" w:sz="4" w:space="0" w:color="8C8C8C"/>
               <w:left w:val="single" w:sz="4" w:space="0" w:color="8C8C8C"/>
@@ -1181,7 +1181,7 @@
         </w:tc>
         <w:tc>
           <w:tcPr>
-            <w:tcW w:type="dxa" w:w="1405"/>
+            <w:tcW w:type="dxa" w:w="1404"/>
             <w:tcBorders>
               <w:top w:val="single" w:sz="4" w:space="0" w:color="8C8C8C"/>
               <w:left w:val="single" w:sz="4" w:space="0" w:color="8C8C8C"/>
@@ -1209,7 +1209,7 @@
         </w:tc>
         <w:tc>
           <w:tcPr>
-            <w:tcW w:type="dxa" w:w="3027"/>
+            <w:tcW w:type="dxa" w:w="2803"/>
             <w:tcBorders>
               <w:top w:val="single" w:sz="4" w:space="0" w:color="8C8C8C"/>
               <w:left w:val="single" w:sz="4" w:space="0" w:color="8C8C8C"/>
@@ -1246,7 +1246,7 @@
       <w:tr>
         <w:tc>
           <w:tcPr>
-            <w:tcW w:type="dxa" w:w="666"/>
+            <w:tcW w:type="dxa" w:w="909"/>
             <w:tcBorders>
               <w:top w:val="single" w:sz="4" w:space="0" w:color="8C8C8C"/>
               <w:left w:val="single" w:sz="4" w:space="0" w:color="8C8C8C"/>
@@ -1274,7 +1274,7 @@
         </w:tc>
         <w:tc>
           <w:tcPr>
-            <w:tcW w:type="dxa" w:w="3027"/>
+            <w:tcW w:type="dxa" w:w="2803"/>
             <w:tcBorders>
               <w:top w:val="single" w:sz="4" w:space="0" w:color="8C8C8C"/>
               <w:left w:val="single" w:sz="4" w:space="0" w:color="8C8C8C"/>
@@ -1302,7 +1302,7 @@
         </w:tc>
         <w:tc>
           <w:tcPr>
-            <w:tcW w:type="dxa" w:w="901"/>
+            <w:tcW w:type="dxa" w:w="1107"/>
             <w:tcBorders>
               <w:top w:val="single" w:sz="4" w:space="0" w:color="8C8C8C"/>
               <w:left w:val="single" w:sz="4" w:space="0" w:color="8C8C8C"/>
@@ -1330,7 +1330,7 @@
         </w:tc>
         <w:tc>
           <w:tcPr>
-            <w:tcW w:type="dxa" w:w="1405"/>
+            <w:tcW w:type="dxa" w:w="1404"/>
             <w:tcBorders>
               <w:top w:val="single" w:sz="4" w:space="0" w:color="8C8C8C"/>
               <w:left w:val="single" w:sz="4" w:space="0" w:color="8C8C8C"/>
@@ -1358,7 +1358,7 @@
         </w:tc>
         <w:tc>
           <w:tcPr>
-            <w:tcW w:type="dxa" w:w="3027"/>
+            <w:tcW w:type="dxa" w:w="2803"/>
             <w:tcBorders>
               <w:top w:val="single" w:sz="4" w:space="0" w:color="8C8C8C"/>
               <w:left w:val="single" w:sz="4" w:space="0" w:color="8C8C8C"/>
@@ -1388,7 +1388,7 @@
       <w:tr>
         <w:tc>
           <w:tcPr>
-            <w:tcW w:type="dxa" w:w="666"/>
+            <w:tcW w:type="dxa" w:w="909"/>
             <w:tcBorders>
               <w:top w:val="single" w:sz="4" w:space="0" w:color="8C8C8C"/>
               <w:left w:val="single" w:sz="4" w:space="0" w:color="8C8C8C"/>
@@ -1416,7 +1416,7 @@
         </w:tc>
         <w:tc>
           <w:tcPr>
-            <w:tcW w:type="dxa" w:w="3027"/>
+            <w:tcW w:type="dxa" w:w="2803"/>
             <w:tcBorders>
               <w:top w:val="single" w:sz="4" w:space="0" w:color="8C8C8C"/>
               <w:left w:val="single" w:sz="4" w:space="0" w:color="8C8C8C"/>
@@ -1444,7 +1444,7 @@
         </w:tc>
         <w:tc>
           <w:tcPr>
-            <w:tcW w:type="dxa" w:w="901"/>
+            <w:tcW w:type="dxa" w:w="1107"/>
             <w:tcBorders>
               <w:top w:val="single" w:sz="4" w:space="0" w:color="8C8C8C"/>
               <w:left w:val="single" w:sz="4" w:space="0" w:color="8C8C8C"/>
@@ -1472,7 +1472,7 @@
         </w:tc>
         <w:tc>
           <w:tcPr>
-            <w:tcW w:type="dxa" w:w="1405"/>
+            <w:tcW w:type="dxa" w:w="1404"/>
             <w:tcBorders>
               <w:top w:val="single" w:sz="4" w:space="0" w:color="8C8C8C"/>
               <w:left w:val="single" w:sz="4" w:space="0" w:color="8C8C8C"/>
@@ -1500,7 +1500,7 @@
         </w:tc>
         <w:tc>
           <w:tcPr>
-            <w:tcW w:type="dxa" w:w="3027"/>
+            <w:tcW w:type="dxa" w:w="2803"/>
             <w:tcBorders>
               <w:top w:val="single" w:sz="4" w:space="0" w:color="8C8C8C"/>
               <w:left w:val="single" w:sz="4" w:space="0" w:color="8C8C8C"/>
@@ -1537,7 +1537,7 @@
       <w:tr>
         <w:tc>
           <w:tcPr>
-            <w:tcW w:type="dxa" w:w="666"/>
+            <w:tcW w:type="dxa" w:w="909"/>
             <w:tcBorders>
               <w:top w:val="single" w:sz="4" w:space="0" w:color="8C8C8C"/>
               <w:left w:val="single" w:sz="4" w:space="0" w:color="8C8C8C"/>
@@ -1565,7 +1565,7 @@
         </w:tc>
         <w:tc>
           <w:tcPr>
-            <w:tcW w:type="dxa" w:w="3027"/>
+            <w:tcW w:type="dxa" w:w="2803"/>
             <w:tcBorders>
               <w:top w:val="single" w:sz="4" w:space="0" w:color="8C8C8C"/>
               <w:left w:val="single" w:sz="4" w:space="0" w:color="8C8C8C"/>
@@ -1593,7 +1593,7 @@
         </w:tc>
         <w:tc>
           <w:tcPr>
-            <w:tcW w:type="dxa" w:w="901"/>
+            <w:tcW w:type="dxa" w:w="1107"/>
             <w:tcBorders>
               <w:top w:val="single" w:sz="4" w:space="0" w:color="8C8C8C"/>
               <w:left w:val="single" w:sz="4" w:space="0" w:color="8C8C8C"/>
@@ -1621,7 +1621,7 @@
         </w:tc>
         <w:tc>
           <w:tcPr>
-            <w:tcW w:type="dxa" w:w="1405"/>
+            <w:tcW w:type="dxa" w:w="1404"/>
             <w:tcBorders>
               <w:top w:val="single" w:sz="4" w:space="0" w:color="8C8C8C"/>
               <w:left w:val="single" w:sz="4" w:space="0" w:color="8C8C8C"/>
@@ -1649,7 +1649,7 @@
         </w:tc>
         <w:tc>
           <w:tcPr>
-            <w:tcW w:type="dxa" w:w="3027"/>
+            <w:tcW w:type="dxa" w:w="2803"/>
             <w:tcBorders>
               <w:top w:val="single" w:sz="4" w:space="0" w:color="8C8C8C"/>
               <w:left w:val="single" w:sz="4" w:space="0" w:color="8C8C8C"/>
@@ -1686,7 +1686,7 @@
       <w:tr>
         <w:tc>
           <w:tcPr>
-            <w:tcW w:type="dxa" w:w="666"/>
+            <w:tcW w:type="dxa" w:w="909"/>
             <w:tcBorders>
               <w:top w:val="single" w:sz="4" w:space="0" w:color="8C8C8C"/>
               <w:left w:val="single" w:sz="4" w:space="0" w:color="8C8C8C"/>
@@ -1714,7 +1714,7 @@
         </w:tc>
         <w:tc>
           <w:tcPr>
-            <w:tcW w:type="dxa" w:w="3027"/>
+            <w:tcW w:type="dxa" w:w="2803"/>
             <w:tcBorders>
               <w:top w:val="single" w:sz="4" w:space="0" w:color="8C8C8C"/>
               <w:left w:val="single" w:sz="4" w:space="0" w:color="8C8C8C"/>
@@ -1742,7 +1742,7 @@
         </w:tc>
         <w:tc>
           <w:tcPr>
-            <w:tcW w:type="dxa" w:w="901"/>
+            <w:tcW w:type="dxa" w:w="1107"/>
             <w:tcBorders>
               <w:top w:val="single" w:sz="4" w:space="0" w:color="8C8C8C"/>
               <w:left w:val="single" w:sz="4" w:space="0" w:color="8C8C8C"/>
@@ -1770,7 +1770,7 @@
         </w:tc>
         <w:tc>
           <w:tcPr>
-            <w:tcW w:type="dxa" w:w="1405"/>
+            <w:tcW w:type="dxa" w:w="1404"/>
             <w:tcBorders>
               <w:top w:val="single" w:sz="4" w:space="0" w:color="8C8C8C"/>
               <w:left w:val="single" w:sz="4" w:space="0" w:color="8C8C8C"/>
@@ -1798,7 +1798,7 @@
         </w:tc>
         <w:tc>
           <w:tcPr>
-            <w:tcW w:type="dxa" w:w="3027"/>
+            <w:tcW w:type="dxa" w:w="2803"/>
             <w:tcBorders>
               <w:top w:val="single" w:sz="4" w:space="0" w:color="8C8C8C"/>
               <w:left w:val="single" w:sz="4" w:space="0" w:color="8C8C8C"/>
@@ -1828,7 +1828,7 @@
       <w:tr>
         <w:tc>
           <w:tcPr>
-            <w:tcW w:type="dxa" w:w="666"/>
+            <w:tcW w:type="dxa" w:w="909"/>
             <w:tcBorders>
               <w:top w:val="single" w:sz="4" w:space="0" w:color="8C8C8C"/>
               <w:left w:val="single" w:sz="4" w:space="0" w:color="8C8C8C"/>
@@ -1856,7 +1856,7 @@
         </w:tc>
         <w:tc>
           <w:tcPr>
-            <w:tcW w:type="dxa" w:w="3027"/>
+            <w:tcW w:type="dxa" w:w="2803"/>
             <w:tcBorders>
               <w:top w:val="single" w:sz="4" w:space="0" w:color="8C8C8C"/>
               <w:left w:val="single" w:sz="4" w:space="0" w:color="8C8C8C"/>
@@ -1884,7 +1884,7 @@
         </w:tc>
         <w:tc>
           <w:tcPr>
-            <w:tcW w:type="dxa" w:w="901"/>
+            <w:tcW w:type="dxa" w:w="1107"/>
             <w:tcBorders>
               <w:top w:val="single" w:sz="4" w:space="0" w:color="8C8C8C"/>
               <w:left w:val="single" w:sz="4" w:space="0" w:color="8C8C8C"/>
@@ -1912,7 +1912,7 @@
         </w:tc>
         <w:tc>
           <w:tcPr>
-            <w:tcW w:type="dxa" w:w="1405"/>
+            <w:tcW w:type="dxa" w:w="1404"/>
             <w:tcBorders>
               <w:top w:val="single" w:sz="4" w:space="0" w:color="8C8C8C"/>
               <w:left w:val="single" w:sz="4" w:space="0" w:color="8C8C8C"/>
@@ -1940,7 +1940,7 @@
         </w:tc>
         <w:tc>
           <w:tcPr>
-            <w:tcW w:type="dxa" w:w="3027"/>
+            <w:tcW w:type="dxa" w:w="2803"/>
             <w:tcBorders>
               <w:top w:val="single" w:sz="4" w:space="0" w:color="8C8C8C"/>
               <w:left w:val="single" w:sz="4" w:space="0" w:color="8C8C8C"/>
@@ -1977,7 +1977,7 @@
       <w:tr>
         <w:tc>
           <w:tcPr>
-            <w:tcW w:type="dxa" w:w="666"/>
+            <w:tcW w:type="dxa" w:w="909"/>
             <w:tcBorders>
               <w:top w:val="single" w:sz="4" w:space="0" w:color="8C8C8C"/>
               <w:left w:val="single" w:sz="4" w:space="0" w:color="8C8C8C"/>
@@ -2005,7 +2005,7 @@
         </w:tc>
         <w:tc>
           <w:tcPr>
-            <w:tcW w:type="dxa" w:w="3027"/>
+            <w:tcW w:type="dxa" w:w="2803"/>
             <w:tcBorders>
               <w:top w:val="single" w:sz="4" w:space="0" w:color="8C8C8C"/>
               <w:left w:val="single" w:sz="4" w:space="0" w:color="8C8C8C"/>
@@ -2033,7 +2033,7 @@
         </w:tc>
         <w:tc>
           <w:tcPr>
-            <w:tcW w:type="dxa" w:w="901"/>
+            <w:tcW w:type="dxa" w:w="1107"/>
             <w:tcBorders>
               <w:top w:val="single" w:sz="4" w:space="0" w:color="8C8C8C"/>
               <w:left w:val="single" w:sz="4" w:space="0" w:color="8C8C8C"/>
@@ -2061,7 +2061,7 @@
         </w:tc>
         <w:tc>
           <w:tcPr>
-            <w:tcW w:type="dxa" w:w="1405"/>
+            <w:tcW w:type="dxa" w:w="1404"/>
             <w:tcBorders>
               <w:top w:val="single" w:sz="4" w:space="0" w:color="8C8C8C"/>
               <w:left w:val="single" w:sz="4" w:space="0" w:color="8C8C8C"/>
@@ -2089,7 +2089,7 @@
         </w:tc>
         <w:tc>
           <w:tcPr>
-            <w:tcW w:type="dxa" w:w="3027"/>
+            <w:tcW w:type="dxa" w:w="2803"/>
             <w:tcBorders>
               <w:top w:val="single" w:sz="4" w:space="0" w:color="8C8C8C"/>
               <w:left w:val="single" w:sz="4" w:space="0" w:color="8C8C8C"/>
@@ -2139,7 +2139,7 @@
       <w:tr>
         <w:tc>
           <w:tcPr>
-            <w:tcW w:type="dxa" w:w="666"/>
+            <w:tcW w:type="dxa" w:w="909"/>
             <w:tcBorders>
               <w:top w:val="single" w:sz="4" w:space="0" w:color="8C8C8C"/>
               <w:left w:val="single" w:sz="4" w:space="0" w:color="8C8C8C"/>
@@ -2167,7 +2167,7 @@
         </w:tc>
         <w:tc>
           <w:tcPr>
-            <w:tcW w:type="dxa" w:w="3027"/>
+            <w:tcW w:type="dxa" w:w="2803"/>
             <w:tcBorders>
               <w:top w:val="single" w:sz="4" w:space="0" w:color="8C8C8C"/>
               <w:left w:val="single" w:sz="4" w:space="0" w:color="8C8C8C"/>
@@ -2195,7 +2195,7 @@
         </w:tc>
         <w:tc>
           <w:tcPr>
-            <w:tcW w:type="dxa" w:w="901"/>
+            <w:tcW w:type="dxa" w:w="1107"/>
             <w:tcBorders>
               <w:top w:val="single" w:sz="4" w:space="0" w:color="8C8C8C"/>
               <w:left w:val="single" w:sz="4" w:space="0" w:color="8C8C8C"/>
@@ -2223,7 +2223,7 @@
         </w:tc>
         <w:tc>
           <w:tcPr>
-            <w:tcW w:type="dxa" w:w="1405"/>
+            <w:tcW w:type="dxa" w:w="1404"/>
             <w:tcBorders>
               <w:top w:val="single" w:sz="4" w:space="0" w:color="8C8C8C"/>
               <w:left w:val="single" w:sz="4" w:space="0" w:color="8C8C8C"/>
@@ -2251,7 +2251,7 @@
         </w:tc>
         <w:tc>
           <w:tcPr>
-            <w:tcW w:type="dxa" w:w="3027"/>
+            <w:tcW w:type="dxa" w:w="2803"/>
             <w:tcBorders>
               <w:top w:val="single" w:sz="4" w:space="0" w:color="8C8C8C"/>
               <w:left w:val="single" w:sz="4" w:space="0" w:color="8C8C8C"/>
@@ -2288,7 +2288,7 @@
       <w:tr>
         <w:tc>
           <w:tcPr>
-            <w:tcW w:type="dxa" w:w="666"/>
+            <w:tcW w:type="dxa" w:w="909"/>
             <w:tcBorders>
               <w:top w:val="single" w:sz="4" w:space="0" w:color="8C8C8C"/>
               <w:left w:val="single" w:sz="4" w:space="0" w:color="8C8C8C"/>
@@ -2316,7 +2316,7 @@
         </w:tc>
         <w:tc>
           <w:tcPr>
-            <w:tcW w:type="dxa" w:w="3027"/>
+            <w:tcW w:type="dxa" w:w="2803"/>
             <w:tcBorders>
               <w:top w:val="single" w:sz="4" w:space="0" w:color="8C8C8C"/>
               <w:left w:val="single" w:sz="4" w:space="0" w:color="8C8C8C"/>
@@ -2344,7 +2344,7 @@
         </w:tc>
         <w:tc>
           <w:tcPr>
-            <w:tcW w:type="dxa" w:w="901"/>
+            <w:tcW w:type="dxa" w:w="1107"/>
             <w:tcBorders>
               <w:top w:val="single" w:sz="4" w:space="0" w:color="8C8C8C"/>
               <w:left w:val="single" w:sz="4" w:space="0" w:color="8C8C8C"/>
@@ -2372,7 +2372,7 @@
         </w:tc>
         <w:tc>
           <w:tcPr>
-            <w:tcW w:type="dxa" w:w="1405"/>
+            <w:tcW w:type="dxa" w:w="1404"/>
             <w:tcBorders>
               <w:top w:val="single" w:sz="4" w:space="0" w:color="8C8C8C"/>
               <w:left w:val="single" w:sz="4" w:space="0" w:color="8C8C8C"/>
@@ -2400,7 +2400,7 @@
         </w:tc>
         <w:tc>
           <w:tcPr>
-            <w:tcW w:type="dxa" w:w="3027"/>
+            <w:tcW w:type="dxa" w:w="2803"/>
             <w:tcBorders>
               <w:top w:val="single" w:sz="4" w:space="0" w:color="8C8C8C"/>
               <w:left w:val="single" w:sz="4" w:space="0" w:color="8C8C8C"/>
@@ -2437,7 +2437,7 @@
       <w:tr>
         <w:tc>
           <w:tcPr>
-            <w:tcW w:type="dxa" w:w="666"/>
+            <w:tcW w:type="dxa" w:w="909"/>
             <w:tcBorders>
               <w:top w:val="single" w:sz="4" w:space="0" w:color="8C8C8C"/>
               <w:left w:val="single" w:sz="4" w:space="0" w:color="8C8C8C"/>
@@ -2465,7 +2465,7 @@
         </w:tc>
         <w:tc>
           <w:tcPr>
-            <w:tcW w:type="dxa" w:w="3027"/>
+            <w:tcW w:type="dxa" w:w="2803"/>
             <w:tcBorders>
               <w:top w:val="single" w:sz="4" w:space="0" w:color="8C8C8C"/>
               <w:left w:val="single" w:sz="4" w:space="0" w:color="8C8C8C"/>
@@ -2493,7 +2493,7 @@
         </w:tc>
         <w:tc>
           <w:tcPr>
-            <w:tcW w:type="dxa" w:w="901"/>
+            <w:tcW w:type="dxa" w:w="1107"/>
             <w:tcBorders>
               <w:top w:val="single" w:sz="4" w:space="0" w:color="8C8C8C"/>
               <w:left w:val="single" w:sz="4" w:space="0" w:color="8C8C8C"/>
@@ -2521,7 +2521,7 @@
         </w:tc>
         <w:tc>
           <w:tcPr>
-            <w:tcW w:type="dxa" w:w="1405"/>
+            <w:tcW w:type="dxa" w:w="1404"/>
             <w:tcBorders>
               <w:top w:val="single" w:sz="4" w:space="0" w:color="8C8C8C"/>
               <w:left w:val="single" w:sz="4" w:space="0" w:color="8C8C8C"/>
@@ -2549,7 +2549,7 @@
         </w:tc>
         <w:tc>
           <w:tcPr>
-            <w:tcW w:type="dxa" w:w="3027"/>
+            <w:tcW w:type="dxa" w:w="2803"/>
             <w:tcBorders>
               <w:top w:val="single" w:sz="4" w:space="0" w:color="8C8C8C"/>
               <w:left w:val="single" w:sz="4" w:space="0" w:color="8C8C8C"/>
@@ -2586,7 +2586,7 @@
       <w:tr>
         <w:tc>
           <w:tcPr>
-            <w:tcW w:type="dxa" w:w="666"/>
+            <w:tcW w:type="dxa" w:w="909"/>
             <w:tcBorders>
               <w:top w:val="single" w:sz="4" w:space="0" w:color="8C8C8C"/>
               <w:left w:val="single" w:sz="4" w:space="0" w:color="8C8C8C"/>
@@ -2614,7 +2614,7 @@
         </w:tc>
         <w:tc>
           <w:tcPr>
-            <w:tcW w:type="dxa" w:w="3027"/>
+            <w:tcW w:type="dxa" w:w="2803"/>
             <w:tcBorders>
               <w:top w:val="single" w:sz="4" w:space="0" w:color="8C8C8C"/>
               <w:left w:val="single" w:sz="4" w:space="0" w:color="8C8C8C"/>
@@ -2642,7 +2642,7 @@
         </w:tc>
         <w:tc>
           <w:tcPr>
-            <w:tcW w:type="dxa" w:w="901"/>
+            <w:tcW w:type="dxa" w:w="1107"/>
             <w:tcBorders>
               <w:top w:val="single" w:sz="4" w:space="0" w:color="8C8C8C"/>
               <w:left w:val="single" w:sz="4" w:space="0" w:color="8C8C8C"/>
@@ -2670,7 +2670,7 @@
         </w:tc>
         <w:tc>
           <w:tcPr>
-            <w:tcW w:type="dxa" w:w="1405"/>
+            <w:tcW w:type="dxa" w:w="1404"/>
             <w:tcBorders>
               <w:top w:val="single" w:sz="4" w:space="0" w:color="8C8C8C"/>
               <w:left w:val="single" w:sz="4" w:space="0" w:color="8C8C8C"/>
@@ -2698,7 +2698,7 @@
         </w:tc>
         <w:tc>
           <w:tcPr>
-            <w:tcW w:type="dxa" w:w="3027"/>
+            <w:tcW w:type="dxa" w:w="2803"/>
             <w:tcBorders>
               <w:top w:val="single" w:sz="4" w:space="0" w:color="8C8C8C"/>
               <w:left w:val="single" w:sz="4" w:space="0" w:color="8C8C8C"/>
@@ -2728,7 +2728,7 @@
       <w:tr>
         <w:tc>
           <w:tcPr>
-            <w:tcW w:type="dxa" w:w="666"/>
+            <w:tcW w:type="dxa" w:w="909"/>
             <w:tcBorders>
               <w:top w:val="single" w:sz="4" w:space="0" w:color="8C8C8C"/>
               <w:left w:val="single" w:sz="4" w:space="0" w:color="8C8C8C"/>
@@ -2756,7 +2756,7 @@
         </w:tc>
         <w:tc>
           <w:tcPr>
-            <w:tcW w:type="dxa" w:w="3027"/>
+            <w:tcW w:type="dxa" w:w="2803"/>
             <w:tcBorders>
               <w:top w:val="single" w:sz="4" w:space="0" w:color="8C8C8C"/>
               <w:left w:val="single" w:sz="4" w:space="0" w:color="8C8C8C"/>
@@ -2784,7 +2784,7 @@
         </w:tc>
         <w:tc>
           <w:tcPr>
-            <w:tcW w:type="dxa" w:w="901"/>
+            <w:tcW w:type="dxa" w:w="1107"/>
             <w:tcBorders>
               <w:top w:val="single" w:sz="4" w:space="0" w:color="8C8C8C"/>
               <w:left w:val="single" w:sz="4" w:space="0" w:color="8C8C8C"/>
@@ -2812,7 +2812,7 @@
         </w:tc>
         <w:tc>
           <w:tcPr>
-            <w:tcW w:type="dxa" w:w="1405"/>
+            <w:tcW w:type="dxa" w:w="1404"/>
             <w:tcBorders>
               <w:top w:val="single" w:sz="4" w:space="0" w:color="8C8C8C"/>
               <w:left w:val="single" w:sz="4" w:space="0" w:color="8C8C8C"/>
@@ -2840,7 +2840,7 @@
         </w:tc>
         <w:tc>
           <w:tcPr>
-            <w:tcW w:type="dxa" w:w="3027"/>
+            <w:tcW w:type="dxa" w:w="2803"/>
             <w:tcBorders>
               <w:top w:val="single" w:sz="4" w:space="0" w:color="8C8C8C"/>
               <w:left w:val="single" w:sz="4" w:space="0" w:color="8C8C8C"/>
@@ -2877,7 +2877,7 @@
       <w:tr>
         <w:tc>
           <w:tcPr>
-            <w:tcW w:type="dxa" w:w="666"/>
+            <w:tcW w:type="dxa" w:w="909"/>
             <w:tcBorders>
               <w:top w:val="single" w:sz="4" w:space="0" w:color="8C8C8C"/>
               <w:left w:val="single" w:sz="4" w:space="0" w:color="8C8C8C"/>
@@ -2905,7 +2905,7 @@
         </w:tc>
         <w:tc>
           <w:tcPr>
-            <w:tcW w:type="dxa" w:w="3027"/>
+            <w:tcW w:type="dxa" w:w="2803"/>
             <w:tcBorders>
               <w:top w:val="single" w:sz="4" w:space="0" w:color="8C8C8C"/>
               <w:left w:val="single" w:sz="4" w:space="0" w:color="8C8C8C"/>
@@ -2933,7 +2933,7 @@
         </w:tc>
         <w:tc>
           <w:tcPr>
-            <w:tcW w:type="dxa" w:w="901"/>
+            <w:tcW w:type="dxa" w:w="1107"/>
             <w:tcBorders>
               <w:top w:val="single" w:sz="4" w:space="0" w:color="8C8C8C"/>
               <w:left w:val="single" w:sz="4" w:space="0" w:color="8C8C8C"/>
@@ -2961,7 +2961,7 @@
         </w:tc>
         <w:tc>
           <w:tcPr>
-            <w:tcW w:type="dxa" w:w="1405"/>
+            <w:tcW w:type="dxa" w:w="1404"/>
             <w:tcBorders>
               <w:top w:val="single" w:sz="4" w:space="0" w:color="8C8C8C"/>
               <w:left w:val="single" w:sz="4" w:space="0" w:color="8C8C8C"/>
@@ -2989,7 +2989,7 @@
         </w:tc>
         <w:tc>
           <w:tcPr>
-            <w:tcW w:type="dxa" w:w="3027"/>
+            <w:tcW w:type="dxa" w:w="2803"/>
             <w:tcBorders>
               <w:top w:val="single" w:sz="4" w:space="0" w:color="8C8C8C"/>
               <w:left w:val="single" w:sz="4" w:space="0" w:color="8C8C8C"/>
@@ -3026,7 +3026,7 @@
       <w:tr>
         <w:tc>
           <w:tcPr>
-            <w:tcW w:type="dxa" w:w="666"/>
+            <w:tcW w:type="dxa" w:w="909"/>
             <w:tcBorders>
               <w:top w:val="single" w:sz="4" w:space="0" w:color="8C8C8C"/>
               <w:left w:val="single" w:sz="4" w:space="0" w:color="8C8C8C"/>
@@ -3054,7 +3054,7 @@
         </w:tc>
         <w:tc>
           <w:tcPr>
-            <w:tcW w:type="dxa" w:w="3027"/>
+            <w:tcW w:type="dxa" w:w="2803"/>
             <w:tcBorders>
               <w:top w:val="single" w:sz="4" w:space="0" w:color="8C8C8C"/>
               <w:left w:val="single" w:sz="4" w:space="0" w:color="8C8C8C"/>
@@ -3082,7 +3082,7 @@
         </w:tc>
         <w:tc>
           <w:tcPr>
-            <w:tcW w:type="dxa" w:w="901"/>
+            <w:tcW w:type="dxa" w:w="1107"/>
             <w:tcBorders>
               <w:top w:val="single" w:sz="4" w:space="0" w:color="8C8C8C"/>
               <w:left w:val="single" w:sz="4" w:space="0" w:color="8C8C8C"/>
@@ -3110,7 +3110,7 @@
         </w:tc>
         <w:tc>
           <w:tcPr>
-            <w:tcW w:type="dxa" w:w="1405"/>
+            <w:tcW w:type="dxa" w:w="1404"/>
             <w:tcBorders>
               <w:top w:val="single" w:sz="4" w:space="0" w:color="8C8C8C"/>
               <w:left w:val="single" w:sz="4" w:space="0" w:color="8C8C8C"/>
@@ -3138,7 +3138,7 @@
         </w:tc>
         <w:tc>
           <w:tcPr>
-            <w:tcW w:type="dxa" w:w="3027"/>
+            <w:tcW w:type="dxa" w:w="2803"/>
             <w:tcBorders>
               <w:top w:val="single" w:sz="4" w:space="0" w:color="8C8C8C"/>
               <w:left w:val="single" w:sz="4" w:space="0" w:color="8C8C8C"/>
@@ -3188,7 +3188,7 @@
       <w:tr>
         <w:tc>
           <w:tcPr>
-            <w:tcW w:type="dxa" w:w="666"/>
+            <w:tcW w:type="dxa" w:w="909"/>
             <w:tcBorders>
               <w:top w:val="single" w:sz="4" w:space="0" w:color="8C8C8C"/>
               <w:left w:val="single" w:sz="4" w:space="0" w:color="8C8C8C"/>
@@ -3216,7 +3216,7 @@
         </w:tc>
         <w:tc>
           <w:tcPr>
-            <w:tcW w:type="dxa" w:w="3027"/>
+            <w:tcW w:type="dxa" w:w="2803"/>
             <w:tcBorders>
               <w:top w:val="single" w:sz="4" w:space="0" w:color="8C8C8C"/>
               <w:left w:val="single" w:sz="4" w:space="0" w:color="8C8C8C"/>
@@ -3244,7 +3244,7 @@
         </w:tc>
         <w:tc>
           <w:tcPr>
-            <w:tcW w:type="dxa" w:w="901"/>
+            <w:tcW w:type="dxa" w:w="1107"/>
             <w:tcBorders>
               <w:top w:val="single" w:sz="4" w:space="0" w:color="8C8C8C"/>
               <w:left w:val="single" w:sz="4" w:space="0" w:color="8C8C8C"/>
@@ -3272,7 +3272,7 @@
         </w:tc>
         <w:tc>
           <w:tcPr>
-            <w:tcW w:type="dxa" w:w="1405"/>
+            <w:tcW w:type="dxa" w:w="1404"/>
             <w:tcBorders>
               <w:top w:val="single" w:sz="4" w:space="0" w:color="8C8C8C"/>
               <w:left w:val="single" w:sz="4" w:space="0" w:color="8C8C8C"/>
@@ -3300,7 +3300,7 @@
         </w:tc>
         <w:tc>
           <w:tcPr>
-            <w:tcW w:type="dxa" w:w="3027"/>
+            <w:tcW w:type="dxa" w:w="2803"/>
             <w:tcBorders>
               <w:top w:val="single" w:sz="4" w:space="0" w:color="8C8C8C"/>
               <w:left w:val="single" w:sz="4" w:space="0" w:color="8C8C8C"/>
@@ -3337,7 +3337,7 @@
       <w:tr>
         <w:tc>
           <w:tcPr>
-            <w:tcW w:type="dxa" w:w="666"/>
+            <w:tcW w:type="dxa" w:w="909"/>
             <w:tcBorders>
               <w:top w:val="single" w:sz="4" w:space="0" w:color="8C8C8C"/>
               <w:left w:val="single" w:sz="4" w:space="0" w:color="8C8C8C"/>
@@ -3365,7 +3365,7 @@
         </w:tc>
         <w:tc>
           <w:tcPr>
-            <w:tcW w:type="dxa" w:w="3027"/>
+            <w:tcW w:type="dxa" w:w="2803"/>
             <w:tcBorders>
               <w:top w:val="single" w:sz="4" w:space="0" w:color="8C8C8C"/>
               <w:left w:val="single" w:sz="4" w:space="0" w:color="8C8C8C"/>
@@ -3393,7 +3393,7 @@
         </w:tc>
         <w:tc>
           <w:tcPr>
-            <w:tcW w:type="dxa" w:w="901"/>
+            <w:tcW w:type="dxa" w:w="1107"/>
             <w:tcBorders>
               <w:top w:val="single" w:sz="4" w:space="0" w:color="8C8C8C"/>
               <w:left w:val="single" w:sz="4" w:space="0" w:color="8C8C8C"/>
@@ -3421,7 +3421,7 @@
         </w:tc>
         <w:tc>
           <w:tcPr>
-            <w:tcW w:type="dxa" w:w="1405"/>
+            <w:tcW w:type="dxa" w:w="1404"/>
             <w:tcBorders>
               <w:top w:val="single" w:sz="4" w:space="0" w:color="8C8C8C"/>
               <w:left w:val="single" w:sz="4" w:space="0" w:color="8C8C8C"/>
@@ -3449,7 +3449,7 @@
         </w:tc>
         <w:tc>
           <w:tcPr>
-            <w:tcW w:type="dxa" w:w="3027"/>
+            <w:tcW w:type="dxa" w:w="2803"/>
             <w:tcBorders>
               <w:top w:val="single" w:sz="4" w:space="0" w:color="8C8C8C"/>
               <w:left w:val="single" w:sz="4" w:space="0" w:color="8C8C8C"/>
@@ -3486,7 +3486,7 @@
       <w:tr>
         <w:tc>
           <w:tcPr>
-            <w:tcW w:type="dxa" w:w="666"/>
+            <w:tcW w:type="dxa" w:w="909"/>
             <w:tcBorders>
               <w:top w:val="single" w:sz="4" w:space="0" w:color="8C8C8C"/>
               <w:left w:val="single" w:sz="4" w:space="0" w:color="8C8C8C"/>
@@ -3514,7 +3514,7 @@
         </w:tc>
         <w:tc>
           <w:tcPr>
-            <w:tcW w:type="dxa" w:w="3027"/>
+            <w:tcW w:type="dxa" w:w="2803"/>
             <w:tcBorders>
               <w:top w:val="single" w:sz="4" w:space="0" w:color="8C8C8C"/>
               <w:left w:val="single" w:sz="4" w:space="0" w:color="8C8C8C"/>
@@ -3542,7 +3542,7 @@
         </w:tc>
         <w:tc>
           <w:tcPr>
-            <w:tcW w:type="dxa" w:w="901"/>
+            <w:tcW w:type="dxa" w:w="1107"/>
             <w:tcBorders>
               <w:top w:val="single" w:sz="4" w:space="0" w:color="8C8C8C"/>
               <w:left w:val="single" w:sz="4" w:space="0" w:color="8C8C8C"/>
@@ -3570,7 +3570,7 @@
         </w:tc>
         <w:tc>
           <w:tcPr>
-            <w:tcW w:type="dxa" w:w="1405"/>
+            <w:tcW w:type="dxa" w:w="1404"/>
             <w:tcBorders>
               <w:top w:val="single" w:sz="4" w:space="0" w:color="8C8C8C"/>
               <w:left w:val="single" w:sz="4" w:space="0" w:color="8C8C8C"/>
@@ -3598,7 +3598,7 @@
         </w:tc>
         <w:tc>
           <w:tcPr>
-            <w:tcW w:type="dxa" w:w="3027"/>
+            <w:tcW w:type="dxa" w:w="2803"/>
             <w:tcBorders>
               <w:top w:val="single" w:sz="4" w:space="0" w:color="8C8C8C"/>
               <w:left w:val="single" w:sz="4" w:space="0" w:color="8C8C8C"/>
@@ -3635,7 +3635,7 @@
       <w:tr>
         <w:tc>
           <w:tcPr>
-            <w:tcW w:type="dxa" w:w="666"/>
+            <w:tcW w:type="dxa" w:w="909"/>
             <w:tcBorders>
               <w:top w:val="single" w:sz="4" w:space="0" w:color="8C8C8C"/>
               <w:left w:val="single" w:sz="4" w:space="0" w:color="8C8C8C"/>
@@ -3663,7 +3663,7 @@
         </w:tc>
         <w:tc>
           <w:tcPr>
-            <w:tcW w:type="dxa" w:w="3027"/>
+            <w:tcW w:type="dxa" w:w="2803"/>
             <w:tcBorders>
               <w:top w:val="single" w:sz="4" w:space="0" w:color="8C8C8C"/>
               <w:left w:val="single" w:sz="4" w:space="0" w:color="8C8C8C"/>
@@ -3691,7 +3691,7 @@
         </w:tc>
         <w:tc>
           <w:tcPr>
-            <w:tcW w:type="dxa" w:w="901"/>
+            <w:tcW w:type="dxa" w:w="1107"/>
             <w:tcBorders>
               <w:top w:val="single" w:sz="4" w:space="0" w:color="8C8C8C"/>
               <w:left w:val="single" w:sz="4" w:space="0" w:color="8C8C8C"/>
@@ -3719,7 +3719,7 @@
         </w:tc>
         <w:tc>
           <w:tcPr>
-            <w:tcW w:type="dxa" w:w="1405"/>
+            <w:tcW w:type="dxa" w:w="1404"/>
             <w:tcBorders>
               <w:top w:val="single" w:sz="4" w:space="0" w:color="8C8C8C"/>
               <w:left w:val="single" w:sz="4" w:space="0" w:color="8C8C8C"/>
@@ -3747,7 +3747,7 @@
         </w:tc>
         <w:tc>
           <w:tcPr>
-            <w:tcW w:type="dxa" w:w="3027"/>
+            <w:tcW w:type="dxa" w:w="2803"/>
             <w:tcBorders>
               <w:top w:val="single" w:sz="4" w:space="0" w:color="8C8C8C"/>
               <w:left w:val="single" w:sz="4" w:space="0" w:color="8C8C8C"/>
@@ -3784,7 +3784,7 @@
       <w:tr>
         <w:tc>
           <w:tcPr>
-            <w:tcW w:type="dxa" w:w="666"/>
+            <w:tcW w:type="dxa" w:w="909"/>
             <w:tcBorders>
               <w:top w:val="single" w:sz="4" w:space="0" w:color="8C8C8C"/>
               <w:left w:val="single" w:sz="4" w:space="0" w:color="8C8C8C"/>
@@ -3812,7 +3812,7 @@
         </w:tc>
         <w:tc>
           <w:tcPr>
-            <w:tcW w:type="dxa" w:w="3027"/>
+            <w:tcW w:type="dxa" w:w="2803"/>
             <w:tcBorders>
               <w:top w:val="single" w:sz="4" w:space="0" w:color="8C8C8C"/>
               <w:left w:val="single" w:sz="4" w:space="0" w:color="8C8C8C"/>
@@ -3840,7 +3840,7 @@
         </w:tc>
         <w:tc>
           <w:tcPr>
-            <w:tcW w:type="dxa" w:w="901"/>
+            <w:tcW w:type="dxa" w:w="1107"/>
             <w:tcBorders>
               <w:top w:val="single" w:sz="4" w:space="0" w:color="8C8C8C"/>
               <w:left w:val="single" w:sz="4" w:space="0" w:color="8C8C8C"/>
@@ -3868,7 +3868,7 @@
         </w:tc>
         <w:tc>
           <w:tcPr>
-            <w:tcW w:type="dxa" w:w="1405"/>
+            <w:tcW w:type="dxa" w:w="1404"/>
             <w:tcBorders>
               <w:top w:val="single" w:sz="4" w:space="0" w:color="8C8C8C"/>
               <w:left w:val="single" w:sz="4" w:space="0" w:color="8C8C8C"/>
@@ -3896,7 +3896,7 @@
         </w:tc>
         <w:tc>
           <w:tcPr>
-            <w:tcW w:type="dxa" w:w="3027"/>
+            <w:tcW w:type="dxa" w:w="2803"/>
             <w:tcBorders>
               <w:top w:val="single" w:sz="4" w:space="0" w:color="8C8C8C"/>
               <w:left w:val="single" w:sz="4" w:space="0" w:color="8C8C8C"/>
@@ -3933,7 +3933,7 @@
       <w:tr>
         <w:tc>
           <w:tcPr>
-            <w:tcW w:type="dxa" w:w="666"/>
+            <w:tcW w:type="dxa" w:w="909"/>
             <w:tcBorders>
               <w:top w:val="single" w:sz="4" w:space="0" w:color="8C8C8C"/>
               <w:left w:val="single" w:sz="4" w:space="0" w:color="8C8C8C"/>
@@ -3961,7 +3961,7 @@
         </w:tc>
         <w:tc>
           <w:tcPr>
-            <w:tcW w:type="dxa" w:w="3027"/>
+            <w:tcW w:type="dxa" w:w="2803"/>
             <w:tcBorders>
               <w:top w:val="single" w:sz="4" w:space="0" w:color="8C8C8C"/>
               <w:left w:val="single" w:sz="4" w:space="0" w:color="8C8C8C"/>
@@ -4002,7 +4002,7 @@
         </w:tc>
         <w:tc>
           <w:tcPr>
-            <w:tcW w:type="dxa" w:w="901"/>
+            <w:tcW w:type="dxa" w:w="1107"/>
             <w:tcBorders>
               <w:top w:val="single" w:sz="4" w:space="0" w:color="8C8C8C"/>
               <w:left w:val="single" w:sz="4" w:space="0" w:color="8C8C8C"/>
@@ -4030,7 +4030,7 @@
         </w:tc>
         <w:tc>
           <w:tcPr>
-            <w:tcW w:type="dxa" w:w="1405"/>
+            <w:tcW w:type="dxa" w:w="1404"/>
             <w:tcBorders>
               <w:top w:val="single" w:sz="4" w:space="0" w:color="8C8C8C"/>
               <w:left w:val="single" w:sz="4" w:space="0" w:color="8C8C8C"/>
@@ -4058,7 +4058,7 @@
         </w:tc>
         <w:tc>
           <w:tcPr>
-            <w:tcW w:type="dxa" w:w="3027"/>
+            <w:tcW w:type="dxa" w:w="2803"/>
             <w:tcBorders>
               <w:top w:val="single" w:sz="4" w:space="0" w:color="8C8C8C"/>
               <w:left w:val="single" w:sz="4" w:space="0" w:color="8C8C8C"/>
@@ -4095,7 +4095,7 @@
       <w:tr>
         <w:tc>
           <w:tcPr>
-            <w:tcW w:type="dxa" w:w="666"/>
+            <w:tcW w:type="dxa" w:w="909"/>
             <w:tcBorders>
               <w:top w:val="single" w:sz="4" w:space="0" w:color="8C8C8C"/>
               <w:left w:val="single" w:sz="4" w:space="0" w:color="8C8C8C"/>
@@ -4123,7 +4123,7 @@
         </w:tc>
         <w:tc>
           <w:tcPr>
-            <w:tcW w:type="dxa" w:w="3027"/>
+            <w:tcW w:type="dxa" w:w="2803"/>
             <w:tcBorders>
               <w:top w:val="single" w:sz="4" w:space="0" w:color="8C8C8C"/>
               <w:left w:val="single" w:sz="4" w:space="0" w:color="8C8C8C"/>
@@ -4164,7 +4164,7 @@
         </w:tc>
         <w:tc>
           <w:tcPr>
-            <w:tcW w:type="dxa" w:w="901"/>
+            <w:tcW w:type="dxa" w:w="1107"/>
             <w:tcBorders>
               <w:top w:val="single" w:sz="4" w:space="0" w:color="8C8C8C"/>
               <w:left w:val="single" w:sz="4" w:space="0" w:color="8C8C8C"/>
@@ -4192,7 +4192,7 @@
         </w:tc>
         <w:tc>
           <w:tcPr>
-            <w:tcW w:type="dxa" w:w="1405"/>
+            <w:tcW w:type="dxa" w:w="1404"/>
             <w:tcBorders>
               <w:top w:val="single" w:sz="4" w:space="0" w:color="8C8C8C"/>
               <w:left w:val="single" w:sz="4" w:space="0" w:color="8C8C8C"/>
@@ -4220,7 +4220,7 @@
         </w:tc>
         <w:tc>
           <w:tcPr>
-            <w:tcW w:type="dxa" w:w="3027"/>
+            <w:tcW w:type="dxa" w:w="2803"/>
             <w:tcBorders>
               <w:top w:val="single" w:sz="4" w:space="0" w:color="8C8C8C"/>
               <w:left w:val="single" w:sz="4" w:space="0" w:color="8C8C8C"/>
@@ -4257,7 +4257,7 @@
       <w:tr>
         <w:tc>
           <w:tcPr>
-            <w:tcW w:type="dxa" w:w="666"/>
+            <w:tcW w:type="dxa" w:w="909"/>
             <w:tcBorders>
               <w:top w:val="single" w:sz="4" w:space="0" w:color="8C8C8C"/>
               <w:left w:val="single" w:sz="4" w:space="0" w:color="8C8C8C"/>
@@ -4285,7 +4285,7 @@
         </w:tc>
         <w:tc>
           <w:tcPr>
-            <w:tcW w:type="dxa" w:w="3027"/>
+            <w:tcW w:type="dxa" w:w="2803"/>
             <w:tcBorders>
               <w:top w:val="single" w:sz="4" w:space="0" w:color="8C8C8C"/>
               <w:left w:val="single" w:sz="4" w:space="0" w:color="8C8C8C"/>
@@ -4326,7 +4326,7 @@
         </w:tc>
         <w:tc>
           <w:tcPr>
-            <w:tcW w:type="dxa" w:w="901"/>
+            <w:tcW w:type="dxa" w:w="1107"/>
             <w:tcBorders>
               <w:top w:val="single" w:sz="4" w:space="0" w:color="8C8C8C"/>
               <w:left w:val="single" w:sz="4" w:space="0" w:color="8C8C8C"/>
@@ -4354,7 +4354,7 @@
         </w:tc>
         <w:tc>
           <w:tcPr>
-            <w:tcW w:type="dxa" w:w="1405"/>
+            <w:tcW w:type="dxa" w:w="1404"/>
             <w:tcBorders>
               <w:top w:val="single" w:sz="4" w:space="0" w:color="8C8C8C"/>
               <w:left w:val="single" w:sz="4" w:space="0" w:color="8C8C8C"/>
@@ -4382,7 +4382,7 @@
         </w:tc>
         <w:tc>
           <w:tcPr>
-            <w:tcW w:type="dxa" w:w="3027"/>
+            <w:tcW w:type="dxa" w:w="2803"/>
             <w:tcBorders>
               <w:top w:val="single" w:sz="4" w:space="0" w:color="8C8C8C"/>
               <w:left w:val="single" w:sz="4" w:space="0" w:color="8C8C8C"/>
@@ -4419,7 +4419,7 @@
       <w:tr>
         <w:tc>
           <w:tcPr>
-            <w:tcW w:type="dxa" w:w="666"/>
+            <w:tcW w:type="dxa" w:w="909"/>
             <w:tcBorders>
               <w:top w:val="single" w:sz="4" w:space="0" w:color="8C8C8C"/>
               <w:left w:val="single" w:sz="4" w:space="0" w:color="8C8C8C"/>
@@ -4447,7 +4447,7 @@
         </w:tc>
         <w:tc>
           <w:tcPr>
-            <w:tcW w:type="dxa" w:w="3027"/>
+            <w:tcW w:type="dxa" w:w="2803"/>
             <w:tcBorders>
               <w:top w:val="single" w:sz="4" w:space="0" w:color="8C8C8C"/>
               <w:left w:val="single" w:sz="4" w:space="0" w:color="8C8C8C"/>
@@ -4475,7 +4475,7 @@
         </w:tc>
         <w:tc>
           <w:tcPr>
-            <w:tcW w:type="dxa" w:w="901"/>
+            <w:tcW w:type="dxa" w:w="1107"/>
             <w:tcBorders>
               <w:top w:val="single" w:sz="4" w:space="0" w:color="8C8C8C"/>
               <w:left w:val="single" w:sz="4" w:space="0" w:color="8C8C8C"/>
@@ -4503,7 +4503,7 @@
         </w:tc>
         <w:tc>
           <w:tcPr>
-            <w:tcW w:type="dxa" w:w="1405"/>
+            <w:tcW w:type="dxa" w:w="1404"/>
             <w:tcBorders>
               <w:top w:val="single" w:sz="4" w:space="0" w:color="8C8C8C"/>
               <w:left w:val="single" w:sz="4" w:space="0" w:color="8C8C8C"/>
@@ -4531,7 +4531,7 @@
         </w:tc>
         <w:tc>
           <w:tcPr>
-            <w:tcW w:type="dxa" w:w="3027"/>
+            <w:tcW w:type="dxa" w:w="2803"/>
             <w:tcBorders>
               <w:top w:val="single" w:sz="4" w:space="0" w:color="8C8C8C"/>
               <w:left w:val="single" w:sz="4" w:space="0" w:color="8C8C8C"/>
@@ -4581,7 +4581,7 @@
       <w:tr>
         <w:tc>
           <w:tcPr>
-            <w:tcW w:type="dxa" w:w="666"/>
+            <w:tcW w:type="dxa" w:w="909"/>
             <w:tcBorders>
               <w:top w:val="single" w:sz="4" w:space="0" w:color="8C8C8C"/>
               <w:left w:val="single" w:sz="4" w:space="0" w:color="8C8C8C"/>
@@ -4609,7 +4609,7 @@
         </w:tc>
         <w:tc>
           <w:tcPr>
-            <w:tcW w:type="dxa" w:w="3027"/>
+            <w:tcW w:type="dxa" w:w="2803"/>
             <w:tcBorders>
               <w:top w:val="single" w:sz="4" w:space="0" w:color="8C8C8C"/>
               <w:left w:val="single" w:sz="4" w:space="0" w:color="8C8C8C"/>
@@ -4637,7 +4637,7 @@
         </w:tc>
         <w:tc>
           <w:tcPr>
-            <w:tcW w:type="dxa" w:w="901"/>
+            <w:tcW w:type="dxa" w:w="1107"/>
             <w:tcBorders>
               <w:top w:val="single" w:sz="4" w:space="0" w:color="8C8C8C"/>
               <w:left w:val="single" w:sz="4" w:space="0" w:color="8C8C8C"/>
@@ -4665,7 +4665,7 @@
         </w:tc>
         <w:tc>
           <w:tcPr>
-            <w:tcW w:type="dxa" w:w="1405"/>
+            <w:tcW w:type="dxa" w:w="1404"/>
             <w:tcBorders>
               <w:top w:val="single" w:sz="4" w:space="0" w:color="8C8C8C"/>
               <w:left w:val="single" w:sz="4" w:space="0" w:color="8C8C8C"/>
@@ -4693,7 +4693,7 @@
         </w:tc>
         <w:tc>
           <w:tcPr>
-            <w:tcW w:type="dxa" w:w="3027"/>
+            <w:tcW w:type="dxa" w:w="2803"/>
             <w:tcBorders>
               <w:top w:val="single" w:sz="4" w:space="0" w:color="8C8C8C"/>
               <w:left w:val="single" w:sz="4" w:space="0" w:color="8C8C8C"/>
@@ -4749,7 +4749,7 @@
       <w:tr>
         <w:tc>
           <w:tcPr>
-            <w:tcW w:type="dxa" w:w="666"/>
+            <w:tcW w:type="dxa" w:w="909"/>
             <w:tcBorders>
               <w:top w:val="single" w:sz="4" w:space="0" w:color="8C8C8C"/>
               <w:left w:val="single" w:sz="4" w:space="0" w:color="8C8C8C"/>
@@ -4777,7 +4777,7 @@
         </w:tc>
         <w:tc>
           <w:tcPr>
-            <w:tcW w:type="dxa" w:w="3027"/>
+            <w:tcW w:type="dxa" w:w="2803"/>
             <w:tcBorders>
               <w:top w:val="single" w:sz="4" w:space="0" w:color="8C8C8C"/>
               <w:left w:val="single" w:sz="4" w:space="0" w:color="8C8C8C"/>
@@ -4805,7 +4805,7 @@
         </w:tc>
         <w:tc>
           <w:tcPr>
-            <w:tcW w:type="dxa" w:w="901"/>
+            <w:tcW w:type="dxa" w:w="1107"/>
             <w:tcBorders>
               <w:top w:val="single" w:sz="4" w:space="0" w:color="8C8C8C"/>
               <w:left w:val="single" w:sz="4" w:space="0" w:color="8C8C8C"/>
@@ -4833,7 +4833,7 @@
         </w:tc>
         <w:tc>
           <w:tcPr>
-            <w:tcW w:type="dxa" w:w="1405"/>
+            <w:tcW w:type="dxa" w:w="1404"/>
             <w:tcBorders>
               <w:top w:val="single" w:sz="4" w:space="0" w:color="8C8C8C"/>
               <w:left w:val="single" w:sz="4" w:space="0" w:color="8C8C8C"/>
@@ -4861,7 +4861,7 @@
         </w:tc>
         <w:tc>
           <w:tcPr>
-            <w:tcW w:type="dxa" w:w="3027"/>
+            <w:tcW w:type="dxa" w:w="2803"/>
             <w:tcBorders>
               <w:top w:val="single" w:sz="4" w:space="0" w:color="8C8C8C"/>
               <w:left w:val="single" w:sz="4" w:space="0" w:color="8C8C8C"/>
@@ -4918,16 +4918,16 @@
         <w:tblLayout w:type="fixed"/>
       </w:tblPr>
       <w:tblGrid>
-        <w:gridCol w:w="653"/>
-        <w:gridCol w:w="2969"/>
-        <w:gridCol w:w="735"/>
-        <w:gridCol w:w="1700"/>
-        <w:gridCol w:w="2969"/>
+        <w:gridCol w:w="909"/>
+        <w:gridCol w:w="2763"/>
+        <w:gridCol w:w="1008"/>
+        <w:gridCol w:w="1582"/>
+        <w:gridCol w:w="2763"/>
       </w:tblGrid>
       <w:tr>
         <w:tc>
           <w:tcPr>
-            <w:tcW w:type="dxa" w:w="653"/>
+            <w:tcW w:type="dxa" w:w="909"/>
             <w:tcBorders>
               <w:top w:val="single" w:sz="4" w:space="0" w:color="8C8C8C"/>
               <w:left w:val="single" w:sz="4" w:space="0" w:color="8C8C8C"/>
@@ -4957,7 +4957,7 @@
         </w:tc>
         <w:tc>
           <w:tcPr>
-            <w:tcW w:type="dxa" w:w="2969"/>
+            <w:tcW w:type="dxa" w:w="2763"/>
             <w:tcBorders>
               <w:top w:val="single" w:sz="4" w:space="0" w:color="8C8C8C"/>
               <w:left w:val="single" w:sz="4" w:space="0" w:color="8C8C8C"/>
@@ -4987,7 +4987,7 @@
         </w:tc>
         <w:tc>
           <w:tcPr>
-            <w:tcW w:type="dxa" w:w="735"/>
+            <w:tcW w:type="dxa" w:w="1008"/>
             <w:tcBorders>
               <w:top w:val="single" w:sz="4" w:space="0" w:color="8C8C8C"/>
               <w:left w:val="single" w:sz="4" w:space="0" w:color="8C8C8C"/>
@@ -5017,7 +5017,7 @@
         </w:tc>
         <w:tc>
           <w:tcPr>
-            <w:tcW w:type="dxa" w:w="1700"/>
+            <w:tcW w:type="dxa" w:w="1582"/>
             <w:tcBorders>
               <w:top w:val="single" w:sz="4" w:space="0" w:color="8C8C8C"/>
               <w:left w:val="single" w:sz="4" w:space="0" w:color="8C8C8C"/>
@@ -5047,7 +5047,7 @@
         </w:tc>
         <w:tc>
           <w:tcPr>
-            <w:tcW w:type="dxa" w:w="2969"/>
+            <w:tcW w:type="dxa" w:w="2763"/>
             <w:tcBorders>
               <w:top w:val="single" w:sz="4" w:space="0" w:color="8C8C8C"/>
               <w:left w:val="single" w:sz="4" w:space="0" w:color="8C8C8C"/>
@@ -5079,7 +5079,7 @@
       <w:tr>
         <w:tc>
           <w:tcPr>
-            <w:tcW w:type="dxa" w:w="653"/>
+            <w:tcW w:type="dxa" w:w="909"/>
             <w:tcBorders>
               <w:top w:val="single" w:sz="4" w:space="0" w:color="8C8C8C"/>
               <w:left w:val="single" w:sz="4" w:space="0" w:color="8C8C8C"/>
@@ -5107,7 +5107,7 @@
         </w:tc>
         <w:tc>
           <w:tcPr>
-            <w:tcW w:type="dxa" w:w="2969"/>
+            <w:tcW w:type="dxa" w:w="2763"/>
             <w:tcBorders>
               <w:top w:val="single" w:sz="4" w:space="0" w:color="8C8C8C"/>
               <w:left w:val="single" w:sz="4" w:space="0" w:color="8C8C8C"/>
@@ -5135,7 +5135,7 @@
         </w:tc>
         <w:tc>
           <w:tcPr>
-            <w:tcW w:type="dxa" w:w="735"/>
+            <w:tcW w:type="dxa" w:w="1008"/>
             <w:tcBorders>
               <w:top w:val="single" w:sz="4" w:space="0" w:color="8C8C8C"/>
               <w:left w:val="single" w:sz="4" w:space="0" w:color="8C8C8C"/>
@@ -5163,7 +5163,7 @@
         </w:tc>
         <w:tc>
           <w:tcPr>
-            <w:tcW w:type="dxa" w:w="1700"/>
+            <w:tcW w:type="dxa" w:w="1582"/>
             <w:tcBorders>
               <w:top w:val="single" w:sz="4" w:space="0" w:color="8C8C8C"/>
               <w:left w:val="single" w:sz="4" w:space="0" w:color="8C8C8C"/>
@@ -5191,7 +5191,7 @@
         </w:tc>
         <w:tc>
           <w:tcPr>
-            <w:tcW w:type="dxa" w:w="2969"/>
+            <w:tcW w:type="dxa" w:w="2763"/>
             <w:tcBorders>
               <w:top w:val="single" w:sz="4" w:space="0" w:color="8C8C8C"/>
               <w:left w:val="single" w:sz="4" w:space="0" w:color="8C8C8C"/>
@@ -5241,7 +5241,7 @@
       <w:tr>
         <w:tc>
           <w:tcPr>
-            <w:tcW w:type="dxa" w:w="653"/>
+            <w:tcW w:type="dxa" w:w="909"/>
             <w:tcBorders>
               <w:top w:val="single" w:sz="4" w:space="0" w:color="8C8C8C"/>
               <w:left w:val="single" w:sz="4" w:space="0" w:color="8C8C8C"/>
@@ -5269,7 +5269,7 @@
         </w:tc>
         <w:tc>
           <w:tcPr>
-            <w:tcW w:type="dxa" w:w="2969"/>
+            <w:tcW w:type="dxa" w:w="2763"/>
             <w:tcBorders>
               <w:top w:val="single" w:sz="4" w:space="0" w:color="8C8C8C"/>
               <w:left w:val="single" w:sz="4" w:space="0" w:color="8C8C8C"/>
@@ -5297,7 +5297,7 @@
         </w:tc>
         <w:tc>
           <w:tcPr>
-            <w:tcW w:type="dxa" w:w="735"/>
+            <w:tcW w:type="dxa" w:w="1008"/>
             <w:tcBorders>
               <w:top w:val="single" w:sz="4" w:space="0" w:color="8C8C8C"/>
               <w:left w:val="single" w:sz="4" w:space="0" w:color="8C8C8C"/>
@@ -5325,7 +5325,7 @@
         </w:tc>
         <w:tc>
           <w:tcPr>
-            <w:tcW w:type="dxa" w:w="1700"/>
+            <w:tcW w:type="dxa" w:w="1582"/>
             <w:tcBorders>
               <w:top w:val="single" w:sz="4" w:space="0" w:color="8C8C8C"/>
               <w:left w:val="single" w:sz="4" w:space="0" w:color="8C8C8C"/>
@@ -5353,7 +5353,7 @@
         </w:tc>
         <w:tc>
           <w:tcPr>
-            <w:tcW w:type="dxa" w:w="2969"/>
+            <w:tcW w:type="dxa" w:w="2763"/>
             <w:tcBorders>
               <w:top w:val="single" w:sz="4" w:space="0" w:color="8C8C8C"/>
               <w:left w:val="single" w:sz="4" w:space="0" w:color="8C8C8C"/>
@@ -5390,7 +5390,7 @@
       <w:tr>
         <w:tc>
           <w:tcPr>
-            <w:tcW w:type="dxa" w:w="653"/>
+            <w:tcW w:type="dxa" w:w="909"/>
             <w:tcBorders>
               <w:top w:val="single" w:sz="4" w:space="0" w:color="8C8C8C"/>
               <w:left w:val="single" w:sz="4" w:space="0" w:color="8C8C8C"/>
@@ -5418,7 +5418,7 @@
         </w:tc>
         <w:tc>
           <w:tcPr>
-            <w:tcW w:type="dxa" w:w="2969"/>
+            <w:tcW w:type="dxa" w:w="2763"/>
             <w:tcBorders>
               <w:top w:val="single" w:sz="4" w:space="0" w:color="8C8C8C"/>
               <w:left w:val="single" w:sz="4" w:space="0" w:color="8C8C8C"/>
@@ -5446,7 +5446,7 @@
         </w:tc>
         <w:tc>
           <w:tcPr>
-            <w:tcW w:type="dxa" w:w="735"/>
+            <w:tcW w:type="dxa" w:w="1008"/>
             <w:tcBorders>
               <w:top w:val="single" w:sz="4" w:space="0" w:color="8C8C8C"/>
               <w:left w:val="single" w:sz="4" w:space="0" w:color="8C8C8C"/>
@@ -5474,7 +5474,7 @@
         </w:tc>
         <w:tc>
           <w:tcPr>
-            <w:tcW w:type="dxa" w:w="1700"/>
+            <w:tcW w:type="dxa" w:w="1582"/>
             <w:tcBorders>
               <w:top w:val="single" w:sz="4" w:space="0" w:color="8C8C8C"/>
               <w:left w:val="single" w:sz="4" w:space="0" w:color="8C8C8C"/>
@@ -5502,7 +5502,7 @@
         </w:tc>
         <w:tc>
           <w:tcPr>
-            <w:tcW w:type="dxa" w:w="2969"/>
+            <w:tcW w:type="dxa" w:w="2763"/>
             <w:tcBorders>
               <w:top w:val="single" w:sz="4" w:space="0" w:color="8C8C8C"/>
               <w:left w:val="single" w:sz="4" w:space="0" w:color="8C8C8C"/>
@@ -5539,7 +5539,7 @@
       <w:tr>
         <w:tc>
           <w:tcPr>
-            <w:tcW w:type="dxa" w:w="653"/>
+            <w:tcW w:type="dxa" w:w="909"/>
             <w:tcBorders>
               <w:top w:val="single" w:sz="4" w:space="0" w:color="8C8C8C"/>
               <w:left w:val="single" w:sz="4" w:space="0" w:color="8C8C8C"/>
@@ -5567,7 +5567,7 @@
         </w:tc>
         <w:tc>
           <w:tcPr>
-            <w:tcW w:type="dxa" w:w="2969"/>
+            <w:tcW w:type="dxa" w:w="2763"/>
             <w:tcBorders>
               <w:top w:val="single" w:sz="4" w:space="0" w:color="8C8C8C"/>
               <w:left w:val="single" w:sz="4" w:space="0" w:color="8C8C8C"/>
@@ -5595,7 +5595,7 @@
         </w:tc>
         <w:tc>
           <w:tcPr>
-            <w:tcW w:type="dxa" w:w="735"/>
+            <w:tcW w:type="dxa" w:w="1008"/>
             <w:tcBorders>
               <w:top w:val="single" w:sz="4" w:space="0" w:color="8C8C8C"/>
               <w:left w:val="single" w:sz="4" w:space="0" w:color="8C8C8C"/>
@@ -5623,7 +5623,7 @@
         </w:tc>
         <w:tc>
           <w:tcPr>
-            <w:tcW w:type="dxa" w:w="1700"/>
+            <w:tcW w:type="dxa" w:w="1582"/>
             <w:tcBorders>
               <w:top w:val="single" w:sz="4" w:space="0" w:color="8C8C8C"/>
               <w:left w:val="single" w:sz="4" w:space="0" w:color="8C8C8C"/>
@@ -5651,29 +5651,29 @@
         </w:tc>
         <w:tc>
           <w:tcPr>
-            <w:tcW w:type="dxa" w:w="2969"/>
-            <w:tcBorders>
-              <w:top w:val="single" w:sz="4" w:space="0" w:color="8C8C8C"/>
-              <w:left w:val="single" w:sz="4" w:space="0" w:color="8C8C8C"/>
-              <w:bottom w:val="single" w:sz="4" w:space="0" w:color="8C8C8C"/>
-              <w:right w:val="single" w:sz="4" w:space="0" w:color="8C8C8C"/>
-            </w:tcBorders>
-            <w:tcMar>
-              <w:top w:w="60" w:type="dxa"/>
-              <w:left w:w="100" w:type="dxa"/>
-              <w:bottom w:w="60" w:type="dxa"/>
-              <w:right w:w="100" w:type="dxa"/>
-            </w:tcMar>
-          </w:tcPr>
-          <w:p>
-            <w:pPr>
-              <w:spacing w:after="0"/>
-            </w:pPr>
-            <w:r>
-              <w:rPr>
-                <w:sz w:val="18"/>
-              </w:rPr>
-              <w:t xml:space="preserve">Kabul testi STD 3.6 (6.5), 3.7 (7.4), 3.8 (8.1, 8.4); kapanırken bekleme: birim testi </w:t>
+            <w:tcW w:type="dxa" w:w="2763"/>
+            <w:tcBorders>
+              <w:top w:val="single" w:sz="4" w:space="0" w:color="8C8C8C"/>
+              <w:left w:val="single" w:sz="4" w:space="0" w:color="8C8C8C"/>
+              <w:bottom w:val="single" w:sz="4" w:space="0" w:color="8C8C8C"/>
+              <w:right w:val="single" w:sz="4" w:space="0" w:color="8C8C8C"/>
+            </w:tcBorders>
+            <w:tcMar>
+              <w:top w:w="60" w:type="dxa"/>
+              <w:left w:w="100" w:type="dxa"/>
+              <w:bottom w:w="60" w:type="dxa"/>
+              <w:right w:w="100" w:type="dxa"/>
+            </w:tcMar>
+          </w:tcPr>
+          <w:p>
+            <w:pPr>
+              <w:spacing w:after="0"/>
+            </w:pPr>
+            <w:r>
+              <w:rPr>
+                <w:sz w:val="18"/>
+              </w:rPr>
+              <w:t xml:space="preserve">Kabul testi STD 3.6 (6.5), 3.7 (7.4), 3.8 (8.1, 8.4); kapanırken bekleme: birim testleri </w:t>
             </w:r>
             <w:r>
               <w:rPr>
@@ -5686,20 +5686,46 @@
               <w:rPr>
                 <w:sz w:val="18"/>
               </w:rPr>
-              <w:t xml:space="preserve"> (diğer sayfalarda </w:t>
+              <w:t xml:space="preserve">, </w:t>
             </w:r>
             <w:r>
               <w:rPr>
                 <w:rFonts w:ascii="Consolas" w:hAnsi="Consolas"/>
                 <w:sz w:val="18"/>
               </w:rPr>
-              <w:t>shutdown()</w:t>
-            </w:r>
-            <w:r>
-              <w:rPr>
-                <w:sz w:val="18"/>
-              </w:rPr>
-              <w:t xml:space="preserve"> yalnızca test sonu temizliğinde çağrılır, beklemeyi sınayan test yok)</w:t>
+              <w:t>tests/unit/gui/test_mutation_page.py::test_shutdown_cancels_running_job_and_waits</w:t>
+            </w:r>
+            <w:r>
+              <w:rPr>
+                <w:sz w:val="18"/>
+              </w:rPr>
+              <w:t xml:space="preserve"> ve </w:t>
+            </w:r>
+            <w:r>
+              <w:rPr>
+                <w:rFonts w:ascii="Consolas" w:hAnsi="Consolas"/>
+                <w:sz w:val="18"/>
+              </w:rPr>
+              <w:t>::test_closing_main_window_shuts_down_running_job</w:t>
+            </w:r>
+            <w:r>
+              <w:rPr>
+                <w:sz w:val="18"/>
+              </w:rPr>
+              <w:t xml:space="preserve">, </w:t>
+            </w:r>
+            <w:r>
+              <w:rPr>
+                <w:rFonts w:ascii="Consolas" w:hAnsi="Consolas"/>
+                <w:sz w:val="18"/>
+              </w:rPr>
+              <w:t>tests/unit/gui/test_analysis_pages.py::test_closing_the_window_waits_for_a_running_analysis</w:t>
+            </w:r>
+            <w:r>
+              <w:rPr>
+                <w:sz w:val="18"/>
+              </w:rPr>
+              <w:t xml:space="preserve"> (RL Test Üretimi ve Toplu Test sayfalarında beklemeyi sınayan test yok)</w:t>
             </w:r>
           </w:p>
         </w:tc>
@@ -5707,7 +5733,7 @@
       <w:tr>
         <w:tc>
           <w:tcPr>
-            <w:tcW w:type="dxa" w:w="653"/>
+            <w:tcW w:type="dxa" w:w="909"/>
             <w:tcBorders>
               <w:top w:val="single" w:sz="4" w:space="0" w:color="8C8C8C"/>
               <w:left w:val="single" w:sz="4" w:space="0" w:color="8C8C8C"/>
@@ -5735,7 +5761,7 @@
         </w:tc>
         <w:tc>
           <w:tcPr>
-            <w:tcW w:type="dxa" w:w="2969"/>
+            <w:tcW w:type="dxa" w:w="2763"/>
             <w:tcBorders>
               <w:top w:val="single" w:sz="4" w:space="0" w:color="8C8C8C"/>
               <w:left w:val="single" w:sz="4" w:space="0" w:color="8C8C8C"/>
@@ -5763,7 +5789,7 @@
         </w:tc>
         <w:tc>
           <w:tcPr>
-            <w:tcW w:type="dxa" w:w="735"/>
+            <w:tcW w:type="dxa" w:w="1008"/>
             <w:tcBorders>
               <w:top w:val="single" w:sz="4" w:space="0" w:color="8C8C8C"/>
               <w:left w:val="single" w:sz="4" w:space="0" w:color="8C8C8C"/>
@@ -5791,7 +5817,7 @@
         </w:tc>
         <w:tc>
           <w:tcPr>
-            <w:tcW w:type="dxa" w:w="1700"/>
+            <w:tcW w:type="dxa" w:w="1582"/>
             <w:tcBorders>
               <w:top w:val="single" w:sz="4" w:space="0" w:color="8C8C8C"/>
               <w:left w:val="single" w:sz="4" w:space="0" w:color="8C8C8C"/>
@@ -5819,7 +5845,7 @@
         </w:tc>
         <w:tc>
           <w:tcPr>
-            <w:tcW w:type="dxa" w:w="2969"/>
+            <w:tcW w:type="dxa" w:w="2763"/>
             <w:tcBorders>
               <w:top w:val="single" w:sz="4" w:space="0" w:color="8C8C8C"/>
               <w:left w:val="single" w:sz="4" w:space="0" w:color="8C8C8C"/>
@@ -5856,7 +5882,7 @@
       <w:tr>
         <w:tc>
           <w:tcPr>
-            <w:tcW w:type="dxa" w:w="653"/>
+            <w:tcW w:type="dxa" w:w="909"/>
             <w:tcBorders>
               <w:top w:val="single" w:sz="4" w:space="0" w:color="8C8C8C"/>
               <w:left w:val="single" w:sz="4" w:space="0" w:color="8C8C8C"/>
@@ -5884,7 +5910,7 @@
         </w:tc>
         <w:tc>
           <w:tcPr>
-            <w:tcW w:type="dxa" w:w="2969"/>
+            <w:tcW w:type="dxa" w:w="2763"/>
             <w:tcBorders>
               <w:top w:val="single" w:sz="4" w:space="0" w:color="8C8C8C"/>
               <w:left w:val="single" w:sz="4" w:space="0" w:color="8C8C8C"/>
@@ -5925,7 +5951,7 @@
         </w:tc>
         <w:tc>
           <w:tcPr>
-            <w:tcW w:type="dxa" w:w="735"/>
+            <w:tcW w:type="dxa" w:w="1008"/>
             <w:tcBorders>
               <w:top w:val="single" w:sz="4" w:space="0" w:color="8C8C8C"/>
               <w:left w:val="single" w:sz="4" w:space="0" w:color="8C8C8C"/>
@@ -5953,7 +5979,7 @@
         </w:tc>
         <w:tc>
           <w:tcPr>
-            <w:tcW w:type="dxa" w:w="1700"/>
+            <w:tcW w:type="dxa" w:w="1582"/>
             <w:tcBorders>
               <w:top w:val="single" w:sz="4" w:space="0" w:color="8C8C8C"/>
               <w:left w:val="single" w:sz="4" w:space="0" w:color="8C8C8C"/>
@@ -5981,7 +6007,7 @@
         </w:tc>
         <w:tc>
           <w:tcPr>
-            <w:tcW w:type="dxa" w:w="2969"/>
+            <w:tcW w:type="dxa" w:w="2763"/>
             <w:tcBorders>
               <w:top w:val="single" w:sz="4" w:space="0" w:color="8C8C8C"/>
               <w:left w:val="single" w:sz="4" w:space="0" w:color="8C8C8C"/>
@@ -6031,7 +6057,7 @@
       <w:tr>
         <w:tc>
           <w:tcPr>
-            <w:tcW w:type="dxa" w:w="653"/>
+            <w:tcW w:type="dxa" w:w="909"/>
             <w:tcBorders>
               <w:top w:val="single" w:sz="4" w:space="0" w:color="8C8C8C"/>
               <w:left w:val="single" w:sz="4" w:space="0" w:color="8C8C8C"/>
@@ -6059,7 +6085,7 @@
         </w:tc>
         <w:tc>
           <w:tcPr>
-            <w:tcW w:type="dxa" w:w="2969"/>
+            <w:tcW w:type="dxa" w:w="2763"/>
             <w:tcBorders>
               <w:top w:val="single" w:sz="4" w:space="0" w:color="8C8C8C"/>
               <w:left w:val="single" w:sz="4" w:space="0" w:color="8C8C8C"/>
@@ -6113,7 +6139,7 @@
         </w:tc>
         <w:tc>
           <w:tcPr>
-            <w:tcW w:type="dxa" w:w="735"/>
+            <w:tcW w:type="dxa" w:w="1008"/>
             <w:tcBorders>
               <w:top w:val="single" w:sz="4" w:space="0" w:color="8C8C8C"/>
               <w:left w:val="single" w:sz="4" w:space="0" w:color="8C8C8C"/>
@@ -6141,7 +6167,7 @@
         </w:tc>
         <w:tc>
           <w:tcPr>
-            <w:tcW w:type="dxa" w:w="1700"/>
+            <w:tcW w:type="dxa" w:w="1582"/>
             <w:tcBorders>
               <w:top w:val="single" w:sz="4" w:space="0" w:color="8C8C8C"/>
               <w:left w:val="single" w:sz="4" w:space="0" w:color="8C8C8C"/>
@@ -6169,7 +6195,7 @@
         </w:tc>
         <w:tc>
           <w:tcPr>
-            <w:tcW w:type="dxa" w:w="2969"/>
+            <w:tcW w:type="dxa" w:w="2763"/>
             <w:tcBorders>
               <w:top w:val="single" w:sz="4" w:space="0" w:color="8C8C8C"/>
               <w:left w:val="single" w:sz="4" w:space="0" w:color="8C8C8C"/>
@@ -6238,7 +6264,7 @@
       <w:tr>
         <w:tc>
           <w:tcPr>
-            <w:tcW w:type="dxa" w:w="653"/>
+            <w:tcW w:type="dxa" w:w="909"/>
             <w:tcBorders>
               <w:top w:val="single" w:sz="4" w:space="0" w:color="8C8C8C"/>
               <w:left w:val="single" w:sz="4" w:space="0" w:color="8C8C8C"/>
@@ -6266,7 +6292,7 @@
         </w:tc>
         <w:tc>
           <w:tcPr>
-            <w:tcW w:type="dxa" w:w="2969"/>
+            <w:tcW w:type="dxa" w:w="2763"/>
             <w:tcBorders>
               <w:top w:val="single" w:sz="4" w:space="0" w:color="8C8C8C"/>
               <w:left w:val="single" w:sz="4" w:space="0" w:color="8C8C8C"/>
@@ -6294,7 +6320,7 @@
         </w:tc>
         <w:tc>
           <w:tcPr>
-            <w:tcW w:type="dxa" w:w="735"/>
+            <w:tcW w:type="dxa" w:w="1008"/>
             <w:tcBorders>
               <w:top w:val="single" w:sz="4" w:space="0" w:color="8C8C8C"/>
               <w:left w:val="single" w:sz="4" w:space="0" w:color="8C8C8C"/>
@@ -6322,7 +6348,7 @@
         </w:tc>
         <w:tc>
           <w:tcPr>
-            <w:tcW w:type="dxa" w:w="1700"/>
+            <w:tcW w:type="dxa" w:w="1582"/>
             <w:tcBorders>
               <w:top w:val="single" w:sz="4" w:space="0" w:color="8C8C8C"/>
               <w:left w:val="single" w:sz="4" w:space="0" w:color="8C8C8C"/>
@@ -6350,7 +6376,7 @@
         </w:tc>
         <w:tc>
           <w:tcPr>
-            <w:tcW w:type="dxa" w:w="2969"/>
+            <w:tcW w:type="dxa" w:w="2763"/>
             <w:tcBorders>
               <w:top w:val="single" w:sz="4" w:space="0" w:color="8C8C8C"/>
               <w:left w:val="single" w:sz="4" w:space="0" w:color="8C8C8C"/>
@@ -6400,16 +6426,16 @@
         <w:tblLayout w:type="fixed"/>
       </w:tblPr>
       <w:tblGrid>
-        <w:gridCol w:w="731"/>
-        <w:gridCol w:w="3322"/>
-        <w:gridCol w:w="731"/>
-        <w:gridCol w:w="954"/>
-        <w:gridCol w:w="3289"/>
+        <w:gridCol w:w="909"/>
+        <w:gridCol w:w="2917"/>
+        <w:gridCol w:w="909"/>
+        <w:gridCol w:w="1404"/>
+        <w:gridCol w:w="2887"/>
       </w:tblGrid>
       <w:tr>
         <w:tc>
           <w:tcPr>
-            <w:tcW w:type="dxa" w:w="731"/>
+            <w:tcW w:type="dxa" w:w="909"/>
             <w:tcBorders>
               <w:top w:val="single" w:sz="4" w:space="0" w:color="8C8C8C"/>
               <w:left w:val="single" w:sz="4" w:space="0" w:color="8C8C8C"/>
@@ -6439,7 +6465,7 @@
         </w:tc>
         <w:tc>
           <w:tcPr>
-            <w:tcW w:type="dxa" w:w="3322"/>
+            <w:tcW w:type="dxa" w:w="2917"/>
             <w:tcBorders>
               <w:top w:val="single" w:sz="4" w:space="0" w:color="8C8C8C"/>
               <w:left w:val="single" w:sz="4" w:space="0" w:color="8C8C8C"/>
@@ -6469,7 +6495,7 @@
         </w:tc>
         <w:tc>
           <w:tcPr>
-            <w:tcW w:type="dxa" w:w="731"/>
+            <w:tcW w:type="dxa" w:w="909"/>
             <w:tcBorders>
               <w:top w:val="single" w:sz="4" w:space="0" w:color="8C8C8C"/>
               <w:left w:val="single" w:sz="4" w:space="0" w:color="8C8C8C"/>
@@ -6499,7 +6525,7 @@
         </w:tc>
         <w:tc>
           <w:tcPr>
-            <w:tcW w:type="dxa" w:w="954"/>
+            <w:tcW w:type="dxa" w:w="1404"/>
             <w:tcBorders>
               <w:top w:val="single" w:sz="4" w:space="0" w:color="8C8C8C"/>
               <w:left w:val="single" w:sz="4" w:space="0" w:color="8C8C8C"/>
@@ -6529,7 +6555,7 @@
         </w:tc>
         <w:tc>
           <w:tcPr>
-            <w:tcW w:type="dxa" w:w="3289"/>
+            <w:tcW w:type="dxa" w:w="2887"/>
             <w:tcBorders>
               <w:top w:val="single" w:sz="4" w:space="0" w:color="8C8C8C"/>
               <w:left w:val="single" w:sz="4" w:space="0" w:color="8C8C8C"/>
@@ -6561,7 +6587,7 @@
       <w:tr>
         <w:tc>
           <w:tcPr>
-            <w:tcW w:type="dxa" w:w="731"/>
+            <w:tcW w:type="dxa" w:w="909"/>
             <w:tcBorders>
               <w:top w:val="single" w:sz="4" w:space="0" w:color="8C8C8C"/>
               <w:left w:val="single" w:sz="4" w:space="0" w:color="8C8C8C"/>
@@ -6589,7 +6615,7 @@
         </w:tc>
         <w:tc>
           <w:tcPr>
-            <w:tcW w:type="dxa" w:w="3322"/>
+            <w:tcW w:type="dxa" w:w="2917"/>
             <w:tcBorders>
               <w:top w:val="single" w:sz="4" w:space="0" w:color="8C8C8C"/>
               <w:left w:val="single" w:sz="4" w:space="0" w:color="8C8C8C"/>
@@ -6617,7 +6643,7 @@
         </w:tc>
         <w:tc>
           <w:tcPr>
-            <w:tcW w:type="dxa" w:w="731"/>
+            <w:tcW w:type="dxa" w:w="909"/>
             <w:tcBorders>
               <w:top w:val="single" w:sz="4" w:space="0" w:color="8C8C8C"/>
               <w:left w:val="single" w:sz="4" w:space="0" w:color="8C8C8C"/>
@@ -6645,7 +6671,7 @@
         </w:tc>
         <w:tc>
           <w:tcPr>
-            <w:tcW w:type="dxa" w:w="954"/>
+            <w:tcW w:type="dxa" w:w="1404"/>
             <w:tcBorders>
               <w:top w:val="single" w:sz="4" w:space="0" w:color="8C8C8C"/>
               <w:left w:val="single" w:sz="4" w:space="0" w:color="8C8C8C"/>
@@ -6673,7 +6699,7 @@
         </w:tc>
         <w:tc>
           <w:tcPr>
-            <w:tcW w:type="dxa" w:w="3289"/>
+            <w:tcW w:type="dxa" w:w="2887"/>
             <w:tcBorders>
               <w:top w:val="single" w:sz="4" w:space="0" w:color="8C8C8C"/>
               <w:left w:val="single" w:sz="4" w:space="0" w:color="8C8C8C"/>
@@ -6729,7 +6755,7 @@
       <w:tr>
         <w:tc>
           <w:tcPr>
-            <w:tcW w:type="dxa" w:w="731"/>
+            <w:tcW w:type="dxa" w:w="909"/>
             <w:tcBorders>
               <w:top w:val="single" w:sz="4" w:space="0" w:color="8C8C8C"/>
               <w:left w:val="single" w:sz="4" w:space="0" w:color="8C8C8C"/>
@@ -6757,7 +6783,7 @@
         </w:tc>
         <w:tc>
           <w:tcPr>
-            <w:tcW w:type="dxa" w:w="3322"/>
+            <w:tcW w:type="dxa" w:w="2917"/>
             <w:tcBorders>
               <w:top w:val="single" w:sz="4" w:space="0" w:color="8C8C8C"/>
               <w:left w:val="single" w:sz="4" w:space="0" w:color="8C8C8C"/>
@@ -6785,7 +6811,7 @@
         </w:tc>
         <w:tc>
           <w:tcPr>
-            <w:tcW w:type="dxa" w:w="731"/>
+            <w:tcW w:type="dxa" w:w="909"/>
             <w:tcBorders>
               <w:top w:val="single" w:sz="4" w:space="0" w:color="8C8C8C"/>
               <w:left w:val="single" w:sz="4" w:space="0" w:color="8C8C8C"/>
@@ -6813,7 +6839,7 @@
         </w:tc>
         <w:tc>
           <w:tcPr>
-            <w:tcW w:type="dxa" w:w="954"/>
+            <w:tcW w:type="dxa" w:w="1404"/>
             <w:tcBorders>
               <w:top w:val="single" w:sz="4" w:space="0" w:color="8C8C8C"/>
               <w:left w:val="single" w:sz="4" w:space="0" w:color="8C8C8C"/>
@@ -6841,7 +6867,7 @@
         </w:tc>
         <w:tc>
           <w:tcPr>
-            <w:tcW w:type="dxa" w:w="3289"/>
+            <w:tcW w:type="dxa" w:w="2887"/>
             <w:tcBorders>
               <w:top w:val="single" w:sz="4" w:space="0" w:color="8C8C8C"/>
               <w:left w:val="single" w:sz="4" w:space="0" w:color="8C8C8C"/>
@@ -6904,7 +6930,7 @@
       <w:tr>
         <w:tc>
           <w:tcPr>
-            <w:tcW w:type="dxa" w:w="731"/>
+            <w:tcW w:type="dxa" w:w="909"/>
             <w:tcBorders>
               <w:top w:val="single" w:sz="4" w:space="0" w:color="8C8C8C"/>
               <w:left w:val="single" w:sz="4" w:space="0" w:color="8C8C8C"/>
@@ -6932,7 +6958,7 @@
         </w:tc>
         <w:tc>
           <w:tcPr>
-            <w:tcW w:type="dxa" w:w="3322"/>
+            <w:tcW w:type="dxa" w:w="2917"/>
             <w:tcBorders>
               <w:top w:val="single" w:sz="4" w:space="0" w:color="8C8C8C"/>
               <w:left w:val="single" w:sz="4" w:space="0" w:color="8C8C8C"/>
@@ -6960,7 +6986,7 @@
         </w:tc>
         <w:tc>
           <w:tcPr>
-            <w:tcW w:type="dxa" w:w="731"/>
+            <w:tcW w:type="dxa" w:w="909"/>
             <w:tcBorders>
               <w:top w:val="single" w:sz="4" w:space="0" w:color="8C8C8C"/>
               <w:left w:val="single" w:sz="4" w:space="0" w:color="8C8C8C"/>
@@ -6988,7 +7014,7 @@
         </w:tc>
         <w:tc>
           <w:tcPr>
-            <w:tcW w:type="dxa" w:w="954"/>
+            <w:tcW w:type="dxa" w:w="1404"/>
             <w:tcBorders>
               <w:top w:val="single" w:sz="4" w:space="0" w:color="8C8C8C"/>
               <w:left w:val="single" w:sz="4" w:space="0" w:color="8C8C8C"/>
@@ -7016,7 +7042,7 @@
         </w:tc>
         <w:tc>
           <w:tcPr>
-            <w:tcW w:type="dxa" w:w="3289"/>
+            <w:tcW w:type="dxa" w:w="2887"/>
             <w:tcBorders>
               <w:top w:val="single" w:sz="4" w:space="0" w:color="8C8C8C"/>
               <w:left w:val="single" w:sz="4" w:space="0" w:color="8C8C8C"/>
@@ -7059,7 +7085,7 @@
       <w:tr>
         <w:tc>
           <w:tcPr>
-            <w:tcW w:type="dxa" w:w="731"/>
+            <w:tcW w:type="dxa" w:w="909"/>
             <w:tcBorders>
               <w:top w:val="single" w:sz="4" w:space="0" w:color="8C8C8C"/>
               <w:left w:val="single" w:sz="4" w:space="0" w:color="8C8C8C"/>
@@ -7087,7 +7113,7 @@
         </w:tc>
         <w:tc>
           <w:tcPr>
-            <w:tcW w:type="dxa" w:w="3322"/>
+            <w:tcW w:type="dxa" w:w="2917"/>
             <w:tcBorders>
               <w:top w:val="single" w:sz="4" w:space="0" w:color="8C8C8C"/>
               <w:left w:val="single" w:sz="4" w:space="0" w:color="8C8C8C"/>
@@ -7115,7 +7141,7 @@
         </w:tc>
         <w:tc>
           <w:tcPr>
-            <w:tcW w:type="dxa" w:w="731"/>
+            <w:tcW w:type="dxa" w:w="909"/>
             <w:tcBorders>
               <w:top w:val="single" w:sz="4" w:space="0" w:color="8C8C8C"/>
               <w:left w:val="single" w:sz="4" w:space="0" w:color="8C8C8C"/>
@@ -7143,7 +7169,7 @@
         </w:tc>
         <w:tc>
           <w:tcPr>
-            <w:tcW w:type="dxa" w:w="954"/>
+            <w:tcW w:type="dxa" w:w="1404"/>
             <w:tcBorders>
               <w:top w:val="single" w:sz="4" w:space="0" w:color="8C8C8C"/>
               <w:left w:val="single" w:sz="4" w:space="0" w:color="8C8C8C"/>
@@ -7171,7 +7197,7 @@
         </w:tc>
         <w:tc>
           <w:tcPr>
-            <w:tcW w:type="dxa" w:w="3289"/>
+            <w:tcW w:type="dxa" w:w="2887"/>
             <w:tcBorders>
               <w:top w:val="single" w:sz="4" w:space="0" w:color="8C8C8C"/>
               <w:left w:val="single" w:sz="4" w:space="0" w:color="8C8C8C"/>
@@ -7201,7 +7227,7 @@
       <w:tr>
         <w:tc>
           <w:tcPr>
-            <w:tcW w:type="dxa" w:w="731"/>
+            <w:tcW w:type="dxa" w:w="909"/>
             <w:tcBorders>
               <w:top w:val="single" w:sz="4" w:space="0" w:color="8C8C8C"/>
               <w:left w:val="single" w:sz="4" w:space="0" w:color="8C8C8C"/>
@@ -7229,7 +7255,7 @@
         </w:tc>
         <w:tc>
           <w:tcPr>
-            <w:tcW w:type="dxa" w:w="3322"/>
+            <w:tcW w:type="dxa" w:w="2917"/>
             <w:tcBorders>
               <w:top w:val="single" w:sz="4" w:space="0" w:color="8C8C8C"/>
               <w:left w:val="single" w:sz="4" w:space="0" w:color="8C8C8C"/>
@@ -7270,7 +7296,7 @@
         </w:tc>
         <w:tc>
           <w:tcPr>
-            <w:tcW w:type="dxa" w:w="731"/>
+            <w:tcW w:type="dxa" w:w="909"/>
             <w:tcBorders>
               <w:top w:val="single" w:sz="4" w:space="0" w:color="8C8C8C"/>
               <w:left w:val="single" w:sz="4" w:space="0" w:color="8C8C8C"/>
@@ -7298,7 +7324,7 @@
         </w:tc>
         <w:tc>
           <w:tcPr>
-            <w:tcW w:type="dxa" w:w="954"/>
+            <w:tcW w:type="dxa" w:w="1404"/>
             <w:tcBorders>
               <w:top w:val="single" w:sz="4" w:space="0" w:color="8C8C8C"/>
               <w:left w:val="single" w:sz="4" w:space="0" w:color="8C8C8C"/>
@@ -7326,7 +7352,7 @@
         </w:tc>
         <w:tc>
           <w:tcPr>
-            <w:tcW w:type="dxa" w:w="3289"/>
+            <w:tcW w:type="dxa" w:w="2887"/>
             <w:tcBorders>
               <w:top w:val="single" w:sz="4" w:space="0" w:color="8C8C8C"/>
               <w:left w:val="single" w:sz="4" w:space="0" w:color="8C8C8C"/>
@@ -7369,7 +7395,7 @@
       <w:tr>
         <w:tc>
           <w:tcPr>
-            <w:tcW w:type="dxa" w:w="731"/>
+            <w:tcW w:type="dxa" w:w="909"/>
             <w:tcBorders>
               <w:top w:val="single" w:sz="4" w:space="0" w:color="8C8C8C"/>
               <w:left w:val="single" w:sz="4" w:space="0" w:color="8C8C8C"/>
@@ -7397,7 +7423,7 @@
         </w:tc>
         <w:tc>
           <w:tcPr>
-            <w:tcW w:type="dxa" w:w="3322"/>
+            <w:tcW w:type="dxa" w:w="2917"/>
             <w:tcBorders>
               <w:top w:val="single" w:sz="4" w:space="0" w:color="8C8C8C"/>
               <w:left w:val="single" w:sz="4" w:space="0" w:color="8C8C8C"/>
@@ -7425,7 +7451,7 @@
         </w:tc>
         <w:tc>
           <w:tcPr>
-            <w:tcW w:type="dxa" w:w="731"/>
+            <w:tcW w:type="dxa" w:w="909"/>
             <w:tcBorders>
               <w:top w:val="single" w:sz="4" w:space="0" w:color="8C8C8C"/>
               <w:left w:val="single" w:sz="4" w:space="0" w:color="8C8C8C"/>
@@ -7453,7 +7479,7 @@
         </w:tc>
         <w:tc>
           <w:tcPr>
-            <w:tcW w:type="dxa" w:w="954"/>
+            <w:tcW w:type="dxa" w:w="1404"/>
             <w:tcBorders>
               <w:top w:val="single" w:sz="4" w:space="0" w:color="8C8C8C"/>
               <w:left w:val="single" w:sz="4" w:space="0" w:color="8C8C8C"/>
@@ -7481,7 +7507,7 @@
         </w:tc>
         <w:tc>
           <w:tcPr>
-            <w:tcW w:type="dxa" w:w="3289"/>
+            <w:tcW w:type="dxa" w:w="2887"/>
             <w:tcBorders>
               <w:top w:val="single" w:sz="4" w:space="0" w:color="8C8C8C"/>
               <w:left w:val="single" w:sz="4" w:space="0" w:color="8C8C8C"/>
@@ -7524,7 +7550,7 @@
       <w:tr>
         <w:tc>
           <w:tcPr>
-            <w:tcW w:type="dxa" w:w="731"/>
+            <w:tcW w:type="dxa" w:w="909"/>
             <w:tcBorders>
               <w:top w:val="single" w:sz="4" w:space="0" w:color="8C8C8C"/>
               <w:left w:val="single" w:sz="4" w:space="0" w:color="8C8C8C"/>
@@ -7552,7 +7578,7 @@
         </w:tc>
         <w:tc>
           <w:tcPr>
-            <w:tcW w:type="dxa" w:w="3322"/>
+            <w:tcW w:type="dxa" w:w="2917"/>
             <w:tcBorders>
               <w:top w:val="single" w:sz="4" w:space="0" w:color="8C8C8C"/>
               <w:left w:val="single" w:sz="4" w:space="0" w:color="8C8C8C"/>
@@ -7580,7 +7606,7 @@
         </w:tc>
         <w:tc>
           <w:tcPr>
-            <w:tcW w:type="dxa" w:w="731"/>
+            <w:tcW w:type="dxa" w:w="909"/>
             <w:tcBorders>
               <w:top w:val="single" w:sz="4" w:space="0" w:color="8C8C8C"/>
               <w:left w:val="single" w:sz="4" w:space="0" w:color="8C8C8C"/>
@@ -7608,7 +7634,7 @@
         </w:tc>
         <w:tc>
           <w:tcPr>
-            <w:tcW w:type="dxa" w:w="954"/>
+            <w:tcW w:type="dxa" w:w="1404"/>
             <w:tcBorders>
               <w:top w:val="single" w:sz="4" w:space="0" w:color="8C8C8C"/>
               <w:left w:val="single" w:sz="4" w:space="0" w:color="8C8C8C"/>
@@ -7636,7 +7662,7 @@
         </w:tc>
         <w:tc>
           <w:tcPr>
-            <w:tcW w:type="dxa" w:w="3289"/>
+            <w:tcW w:type="dxa" w:w="2887"/>
             <w:tcBorders>
               <w:top w:val="single" w:sz="4" w:space="0" w:color="8C8C8C"/>
               <w:left w:val="single" w:sz="4" w:space="0" w:color="8C8C8C"/>
@@ -7718,7 +7744,7 @@
       <w:tr>
         <w:tc>
           <w:tcPr>
-            <w:tcW w:type="dxa" w:w="731"/>
+            <w:tcW w:type="dxa" w:w="909"/>
             <w:tcBorders>
               <w:top w:val="single" w:sz="4" w:space="0" w:color="8C8C8C"/>
               <w:left w:val="single" w:sz="4" w:space="0" w:color="8C8C8C"/>
@@ -7746,7 +7772,7 @@
         </w:tc>
         <w:tc>
           <w:tcPr>
-            <w:tcW w:type="dxa" w:w="3322"/>
+            <w:tcW w:type="dxa" w:w="2917"/>
             <w:tcBorders>
               <w:top w:val="single" w:sz="4" w:space="0" w:color="8C8C8C"/>
               <w:left w:val="single" w:sz="4" w:space="0" w:color="8C8C8C"/>
@@ -7787,7 +7813,7 @@
         </w:tc>
         <w:tc>
           <w:tcPr>
-            <w:tcW w:type="dxa" w:w="731"/>
+            <w:tcW w:type="dxa" w:w="909"/>
             <w:tcBorders>
               <w:top w:val="single" w:sz="4" w:space="0" w:color="8C8C8C"/>
               <w:left w:val="single" w:sz="4" w:space="0" w:color="8C8C8C"/>
@@ -7815,7 +7841,7 @@
         </w:tc>
         <w:tc>
           <w:tcPr>
-            <w:tcW w:type="dxa" w:w="954"/>
+            <w:tcW w:type="dxa" w:w="1404"/>
             <w:tcBorders>
               <w:top w:val="single" w:sz="4" w:space="0" w:color="8C8C8C"/>
               <w:left w:val="single" w:sz="4" w:space="0" w:color="8C8C8C"/>
@@ -7843,7 +7869,7 @@
         </w:tc>
         <w:tc>
           <w:tcPr>
-            <w:tcW w:type="dxa" w:w="3289"/>
+            <w:tcW w:type="dxa" w:w="2887"/>
             <w:tcBorders>
               <w:top w:val="single" w:sz="4" w:space="0" w:color="8C8C8C"/>
               <w:left w:val="single" w:sz="4" w:space="0" w:color="8C8C8C"/>
@@ -7886,7 +7912,7 @@
       <w:tr>
         <w:tc>
           <w:tcPr>
-            <w:tcW w:type="dxa" w:w="731"/>
+            <w:tcW w:type="dxa" w:w="909"/>
             <w:tcBorders>
               <w:top w:val="single" w:sz="4" w:space="0" w:color="8C8C8C"/>
               <w:left w:val="single" w:sz="4" w:space="0" w:color="8C8C8C"/>
@@ -7914,7 +7940,7 @@
         </w:tc>
         <w:tc>
           <w:tcPr>
-            <w:tcW w:type="dxa" w:w="3322"/>
+            <w:tcW w:type="dxa" w:w="2917"/>
             <w:tcBorders>
               <w:top w:val="single" w:sz="4" w:space="0" w:color="8C8C8C"/>
               <w:left w:val="single" w:sz="4" w:space="0" w:color="8C8C8C"/>
@@ -7942,7 +7968,7 @@
         </w:tc>
         <w:tc>
           <w:tcPr>
-            <w:tcW w:type="dxa" w:w="731"/>
+            <w:tcW w:type="dxa" w:w="909"/>
             <w:tcBorders>
               <w:top w:val="single" w:sz="4" w:space="0" w:color="8C8C8C"/>
               <w:left w:val="single" w:sz="4" w:space="0" w:color="8C8C8C"/>
@@ -7970,7 +7996,7 @@
         </w:tc>
         <w:tc>
           <w:tcPr>
-            <w:tcW w:type="dxa" w:w="954"/>
+            <w:tcW w:type="dxa" w:w="1404"/>
             <w:tcBorders>
               <w:top w:val="single" w:sz="4" w:space="0" w:color="8C8C8C"/>
               <w:left w:val="single" w:sz="4" w:space="0" w:color="8C8C8C"/>
@@ -7998,7 +8024,7 @@
         </w:tc>
         <w:tc>
           <w:tcPr>
-            <w:tcW w:type="dxa" w:w="3289"/>
+            <w:tcW w:type="dxa" w:w="2887"/>
             <w:tcBorders>
               <w:top w:val="single" w:sz="4" w:space="0" w:color="8C8C8C"/>
               <w:left w:val="single" w:sz="4" w:space="0" w:color="8C8C8C"/>
@@ -8028,7 +8054,7 @@
       <w:tr>
         <w:tc>
           <w:tcPr>
-            <w:tcW w:type="dxa" w:w="731"/>
+            <w:tcW w:type="dxa" w:w="909"/>
             <w:tcBorders>
               <w:top w:val="single" w:sz="4" w:space="0" w:color="8C8C8C"/>
               <w:left w:val="single" w:sz="4" w:space="0" w:color="8C8C8C"/>
@@ -8056,7 +8082,7 @@
         </w:tc>
         <w:tc>
           <w:tcPr>
-            <w:tcW w:type="dxa" w:w="3322"/>
+            <w:tcW w:type="dxa" w:w="2917"/>
             <w:tcBorders>
               <w:top w:val="single" w:sz="4" w:space="0" w:color="8C8C8C"/>
               <w:left w:val="single" w:sz="4" w:space="0" w:color="8C8C8C"/>
@@ -8084,7 +8110,7 @@
         </w:tc>
         <w:tc>
           <w:tcPr>
-            <w:tcW w:type="dxa" w:w="731"/>
+            <w:tcW w:type="dxa" w:w="909"/>
             <w:tcBorders>
               <w:top w:val="single" w:sz="4" w:space="0" w:color="8C8C8C"/>
               <w:left w:val="single" w:sz="4" w:space="0" w:color="8C8C8C"/>
@@ -8112,7 +8138,7 @@
         </w:tc>
         <w:tc>
           <w:tcPr>
-            <w:tcW w:type="dxa" w:w="954"/>
+            <w:tcW w:type="dxa" w:w="1404"/>
             <w:tcBorders>
               <w:top w:val="single" w:sz="4" w:space="0" w:color="8C8C8C"/>
               <w:left w:val="single" w:sz="4" w:space="0" w:color="8C8C8C"/>
@@ -8140,7 +8166,7 @@
         </w:tc>
         <w:tc>
           <w:tcPr>
-            <w:tcW w:type="dxa" w:w="3289"/>
+            <w:tcW w:type="dxa" w:w="2887"/>
             <w:tcBorders>
               <w:top w:val="single" w:sz="4" w:space="0" w:color="8C8C8C"/>
               <w:left w:val="single" w:sz="4" w:space="0" w:color="8C8C8C"/>
@@ -8183,7 +8209,7 @@
       <w:tr>
         <w:tc>
           <w:tcPr>
-            <w:tcW w:type="dxa" w:w="731"/>
+            <w:tcW w:type="dxa" w:w="909"/>
             <w:tcBorders>
               <w:top w:val="single" w:sz="4" w:space="0" w:color="8C8C8C"/>
               <w:left w:val="single" w:sz="4" w:space="0" w:color="8C8C8C"/>
@@ -8211,7 +8237,7 @@
         </w:tc>
         <w:tc>
           <w:tcPr>
-            <w:tcW w:type="dxa" w:w="3322"/>
+            <w:tcW w:type="dxa" w:w="2917"/>
             <w:tcBorders>
               <w:top w:val="single" w:sz="4" w:space="0" w:color="8C8C8C"/>
               <w:left w:val="single" w:sz="4" w:space="0" w:color="8C8C8C"/>
@@ -8239,7 +8265,7 @@
         </w:tc>
         <w:tc>
           <w:tcPr>
-            <w:tcW w:type="dxa" w:w="731"/>
+            <w:tcW w:type="dxa" w:w="909"/>
             <w:tcBorders>
               <w:top w:val="single" w:sz="4" w:space="0" w:color="8C8C8C"/>
               <w:left w:val="single" w:sz="4" w:space="0" w:color="8C8C8C"/>
@@ -8267,7 +8293,7 @@
         </w:tc>
         <w:tc>
           <w:tcPr>
-            <w:tcW w:type="dxa" w:w="954"/>
+            <w:tcW w:type="dxa" w:w="1404"/>
             <w:tcBorders>
               <w:top w:val="single" w:sz="4" w:space="0" w:color="8C8C8C"/>
               <w:left w:val="single" w:sz="4" w:space="0" w:color="8C8C8C"/>
@@ -8295,7 +8321,7 @@
         </w:tc>
         <w:tc>
           <w:tcPr>
-            <w:tcW w:type="dxa" w:w="3289"/>
+            <w:tcW w:type="dxa" w:w="2887"/>
             <w:tcBorders>
               <w:top w:val="single" w:sz="4" w:space="0" w:color="8C8C8C"/>
               <w:left w:val="single" w:sz="4" w:space="0" w:color="8C8C8C"/>
@@ -8325,7 +8351,7 @@
       <w:tr>
         <w:tc>
           <w:tcPr>
-            <w:tcW w:type="dxa" w:w="731"/>
+            <w:tcW w:type="dxa" w:w="909"/>
             <w:tcBorders>
               <w:top w:val="single" w:sz="4" w:space="0" w:color="8C8C8C"/>
               <w:left w:val="single" w:sz="4" w:space="0" w:color="8C8C8C"/>
@@ -8353,7 +8379,7 @@
         </w:tc>
         <w:tc>
           <w:tcPr>
-            <w:tcW w:type="dxa" w:w="3322"/>
+            <w:tcW w:type="dxa" w:w="2917"/>
             <w:tcBorders>
               <w:top w:val="single" w:sz="4" w:space="0" w:color="8C8C8C"/>
               <w:left w:val="single" w:sz="4" w:space="0" w:color="8C8C8C"/>
@@ -8381,7 +8407,7 @@
         </w:tc>
         <w:tc>
           <w:tcPr>
-            <w:tcW w:type="dxa" w:w="731"/>
+            <w:tcW w:type="dxa" w:w="909"/>
             <w:tcBorders>
               <w:top w:val="single" w:sz="4" w:space="0" w:color="8C8C8C"/>
               <w:left w:val="single" w:sz="4" w:space="0" w:color="8C8C8C"/>
@@ -8409,7 +8435,7 @@
         </w:tc>
         <w:tc>
           <w:tcPr>
-            <w:tcW w:type="dxa" w:w="954"/>
+            <w:tcW w:type="dxa" w:w="1404"/>
             <w:tcBorders>
               <w:top w:val="single" w:sz="4" w:space="0" w:color="8C8C8C"/>
               <w:left w:val="single" w:sz="4" w:space="0" w:color="8C8C8C"/>
@@ -8437,7 +8463,7 @@
         </w:tc>
         <w:tc>
           <w:tcPr>
-            <w:tcW w:type="dxa" w:w="3289"/>
+            <w:tcW w:type="dxa" w:w="2887"/>
             <w:tcBorders>
               <w:top w:val="single" w:sz="4" w:space="0" w:color="8C8C8C"/>
               <w:left w:val="single" w:sz="4" w:space="0" w:color="8C8C8C"/>
@@ -8467,7 +8493,7 @@
       <w:tr>
         <w:tc>
           <w:tcPr>
-            <w:tcW w:type="dxa" w:w="731"/>
+            <w:tcW w:type="dxa" w:w="909"/>
             <w:tcBorders>
               <w:top w:val="single" w:sz="4" w:space="0" w:color="8C8C8C"/>
               <w:left w:val="single" w:sz="4" w:space="0" w:color="8C8C8C"/>
@@ -8495,7 +8521,7 @@
         </w:tc>
         <w:tc>
           <w:tcPr>
-            <w:tcW w:type="dxa" w:w="3322"/>
+            <w:tcW w:type="dxa" w:w="2917"/>
             <w:tcBorders>
               <w:top w:val="single" w:sz="4" w:space="0" w:color="8C8C8C"/>
               <w:left w:val="single" w:sz="4" w:space="0" w:color="8C8C8C"/>
@@ -8523,7 +8549,7 @@
         </w:tc>
         <w:tc>
           <w:tcPr>
-            <w:tcW w:type="dxa" w:w="731"/>
+            <w:tcW w:type="dxa" w:w="909"/>
             <w:tcBorders>
               <w:top w:val="single" w:sz="4" w:space="0" w:color="8C8C8C"/>
               <w:left w:val="single" w:sz="4" w:space="0" w:color="8C8C8C"/>
@@ -8551,7 +8577,7 @@
         </w:tc>
         <w:tc>
           <w:tcPr>
-            <w:tcW w:type="dxa" w:w="954"/>
+            <w:tcW w:type="dxa" w:w="1404"/>
             <w:tcBorders>
               <w:top w:val="single" w:sz="4" w:space="0" w:color="8C8C8C"/>
               <w:left w:val="single" w:sz="4" w:space="0" w:color="8C8C8C"/>
@@ -8579,7 +8605,7 @@
         </w:tc>
         <w:tc>
           <w:tcPr>
-            <w:tcW w:type="dxa" w:w="3289"/>
+            <w:tcW w:type="dxa" w:w="2887"/>
             <w:tcBorders>
               <w:top w:val="single" w:sz="4" w:space="0" w:color="8C8C8C"/>
               <w:left w:val="single" w:sz="4" w:space="0" w:color="8C8C8C"/>
@@ -8609,7 +8635,7 @@
       <w:tr>
         <w:tc>
           <w:tcPr>
-            <w:tcW w:type="dxa" w:w="731"/>
+            <w:tcW w:type="dxa" w:w="909"/>
             <w:tcBorders>
               <w:top w:val="single" w:sz="4" w:space="0" w:color="8C8C8C"/>
               <w:left w:val="single" w:sz="4" w:space="0" w:color="8C8C8C"/>
@@ -8637,7 +8663,7 @@
         </w:tc>
         <w:tc>
           <w:tcPr>
-            <w:tcW w:type="dxa" w:w="3322"/>
+            <w:tcW w:type="dxa" w:w="2917"/>
             <w:tcBorders>
               <w:top w:val="single" w:sz="4" w:space="0" w:color="8C8C8C"/>
               <w:left w:val="single" w:sz="4" w:space="0" w:color="8C8C8C"/>
@@ -8665,7 +8691,7 @@
         </w:tc>
         <w:tc>
           <w:tcPr>
-            <w:tcW w:type="dxa" w:w="731"/>
+            <w:tcW w:type="dxa" w:w="909"/>
             <w:tcBorders>
               <w:top w:val="single" w:sz="4" w:space="0" w:color="8C8C8C"/>
               <w:left w:val="single" w:sz="4" w:space="0" w:color="8C8C8C"/>
@@ -8693,7 +8719,7 @@
         </w:tc>
         <w:tc>
           <w:tcPr>
-            <w:tcW w:type="dxa" w:w="954"/>
+            <w:tcW w:type="dxa" w:w="1404"/>
             <w:tcBorders>
               <w:top w:val="single" w:sz="4" w:space="0" w:color="8C8C8C"/>
               <w:left w:val="single" w:sz="4" w:space="0" w:color="8C8C8C"/>
@@ -8721,7 +8747,7 @@
         </w:tc>
         <w:tc>
           <w:tcPr>
-            <w:tcW w:type="dxa" w:w="3289"/>
+            <w:tcW w:type="dxa" w:w="2887"/>
             <w:tcBorders>
               <w:top w:val="single" w:sz="4" w:space="0" w:color="8C8C8C"/>
               <w:left w:val="single" w:sz="4" w:space="0" w:color="8C8C8C"/>
@@ -8779,16 +8805,16 @@
         <w:tblLayout w:type="fixed"/>
       </w:tblPr>
       <w:tblGrid>
-        <w:gridCol w:w="915"/>
-        <w:gridCol w:w="2121"/>
-        <w:gridCol w:w="915"/>
-        <w:gridCol w:w="915"/>
-        <w:gridCol w:w="4159"/>
+        <w:gridCol w:w="909"/>
+        <w:gridCol w:w="2037"/>
+        <w:gridCol w:w="879"/>
+        <w:gridCol w:w="1206"/>
+        <w:gridCol w:w="3995"/>
       </w:tblGrid>
       <w:tr>
         <w:tc>
           <w:tcPr>
-            <w:tcW w:type="dxa" w:w="915"/>
+            <w:tcW w:type="dxa" w:w="909"/>
             <w:tcBorders>
               <w:top w:val="single" w:sz="4" w:space="0" w:color="8C8C8C"/>
               <w:left w:val="single" w:sz="4" w:space="0" w:color="8C8C8C"/>
@@ -8818,7 +8844,7 @@
         </w:tc>
         <w:tc>
           <w:tcPr>
-            <w:tcW w:type="dxa" w:w="2121"/>
+            <w:tcW w:type="dxa" w:w="2037"/>
             <w:tcBorders>
               <w:top w:val="single" w:sz="4" w:space="0" w:color="8C8C8C"/>
               <w:left w:val="single" w:sz="4" w:space="0" w:color="8C8C8C"/>
@@ -8848,7 +8874,7 @@
         </w:tc>
         <w:tc>
           <w:tcPr>
-            <w:tcW w:type="dxa" w:w="915"/>
+            <w:tcW w:type="dxa" w:w="879"/>
             <w:tcBorders>
               <w:top w:val="single" w:sz="4" w:space="0" w:color="8C8C8C"/>
               <w:left w:val="single" w:sz="4" w:space="0" w:color="8C8C8C"/>
@@ -8878,7 +8904,7 @@
         </w:tc>
         <w:tc>
           <w:tcPr>
-            <w:tcW w:type="dxa" w:w="915"/>
+            <w:tcW w:type="dxa" w:w="1206"/>
             <w:tcBorders>
               <w:top w:val="single" w:sz="4" w:space="0" w:color="8C8C8C"/>
               <w:left w:val="single" w:sz="4" w:space="0" w:color="8C8C8C"/>
@@ -8908,7 +8934,7 @@
         </w:tc>
         <w:tc>
           <w:tcPr>
-            <w:tcW w:type="dxa" w:w="4159"/>
+            <w:tcW w:type="dxa" w:w="3995"/>
             <w:tcBorders>
               <w:top w:val="single" w:sz="4" w:space="0" w:color="8C8C8C"/>
               <w:left w:val="single" w:sz="4" w:space="0" w:color="8C8C8C"/>
@@ -8940,7 +8966,7 @@
       <w:tr>
         <w:tc>
           <w:tcPr>
-            <w:tcW w:type="dxa" w:w="915"/>
+            <w:tcW w:type="dxa" w:w="909"/>
             <w:tcBorders>
               <w:top w:val="single" w:sz="4" w:space="0" w:color="8C8C8C"/>
               <w:left w:val="single" w:sz="4" w:space="0" w:color="8C8C8C"/>
@@ -8968,7 +8994,7 @@
         </w:tc>
         <w:tc>
           <w:tcPr>
-            <w:tcW w:type="dxa" w:w="2121"/>
+            <w:tcW w:type="dxa" w:w="2037"/>
             <w:tcBorders>
               <w:top w:val="single" w:sz="4" w:space="0" w:color="8C8C8C"/>
               <w:left w:val="single" w:sz="4" w:space="0" w:color="8C8C8C"/>
@@ -8996,7 +9022,7 @@
         </w:tc>
         <w:tc>
           <w:tcPr>
-            <w:tcW w:type="dxa" w:w="915"/>
+            <w:tcW w:type="dxa" w:w="879"/>
             <w:tcBorders>
               <w:top w:val="single" w:sz="4" w:space="0" w:color="8C8C8C"/>
               <w:left w:val="single" w:sz="4" w:space="0" w:color="8C8C8C"/>
@@ -9024,7 +9050,7 @@
         </w:tc>
         <w:tc>
           <w:tcPr>
-            <w:tcW w:type="dxa" w:w="915"/>
+            <w:tcW w:type="dxa" w:w="1206"/>
             <w:tcBorders>
               <w:top w:val="single" w:sz="4" w:space="0" w:color="8C8C8C"/>
               <w:left w:val="single" w:sz="4" w:space="0" w:color="8C8C8C"/>
@@ -9052,7 +9078,7 @@
         </w:tc>
         <w:tc>
           <w:tcPr>
-            <w:tcW w:type="dxa" w:w="4159"/>
+            <w:tcW w:type="dxa" w:w="3995"/>
             <w:tcBorders>
               <w:top w:val="single" w:sz="4" w:space="0" w:color="8C8C8C"/>
               <w:left w:val="single" w:sz="4" w:space="0" w:color="8C8C8C"/>
@@ -9082,7 +9108,7 @@
       <w:tr>
         <w:tc>
           <w:tcPr>
-            <w:tcW w:type="dxa" w:w="915"/>
+            <w:tcW w:type="dxa" w:w="909"/>
             <w:tcBorders>
               <w:top w:val="single" w:sz="4" w:space="0" w:color="8C8C8C"/>
               <w:left w:val="single" w:sz="4" w:space="0" w:color="8C8C8C"/>
@@ -9110,7 +9136,7 @@
         </w:tc>
         <w:tc>
           <w:tcPr>
-            <w:tcW w:type="dxa" w:w="2121"/>
+            <w:tcW w:type="dxa" w:w="2037"/>
             <w:tcBorders>
               <w:top w:val="single" w:sz="4" w:space="0" w:color="8C8C8C"/>
               <w:left w:val="single" w:sz="4" w:space="0" w:color="8C8C8C"/>
@@ -9138,7 +9164,7 @@
         </w:tc>
         <w:tc>
           <w:tcPr>
-            <w:tcW w:type="dxa" w:w="915"/>
+            <w:tcW w:type="dxa" w:w="879"/>
             <w:tcBorders>
               <w:top w:val="single" w:sz="4" w:space="0" w:color="8C8C8C"/>
               <w:left w:val="single" w:sz="4" w:space="0" w:color="8C8C8C"/>
@@ -9166,7 +9192,7 @@
         </w:tc>
         <w:tc>
           <w:tcPr>
-            <w:tcW w:type="dxa" w:w="915"/>
+            <w:tcW w:type="dxa" w:w="1206"/>
             <w:tcBorders>
               <w:top w:val="single" w:sz="4" w:space="0" w:color="8C8C8C"/>
               <w:left w:val="single" w:sz="4" w:space="0" w:color="8C8C8C"/>
@@ -9194,7 +9220,7 @@
         </w:tc>
         <w:tc>
           <w:tcPr>
-            <w:tcW w:type="dxa" w:w="4159"/>
+            <w:tcW w:type="dxa" w:w="3995"/>
             <w:tcBorders>
               <w:top w:val="single" w:sz="4" w:space="0" w:color="8C8C8C"/>
               <w:left w:val="single" w:sz="4" w:space="0" w:color="8C8C8C"/>
@@ -9224,7 +9250,7 @@
       <w:tr>
         <w:tc>
           <w:tcPr>
-            <w:tcW w:type="dxa" w:w="915"/>
+            <w:tcW w:type="dxa" w:w="909"/>
             <w:tcBorders>
               <w:top w:val="single" w:sz="4" w:space="0" w:color="8C8C8C"/>
               <w:left w:val="single" w:sz="4" w:space="0" w:color="8C8C8C"/>
@@ -9252,7 +9278,7 @@
         </w:tc>
         <w:tc>
           <w:tcPr>
-            <w:tcW w:type="dxa" w:w="2121"/>
+            <w:tcW w:type="dxa" w:w="2037"/>
             <w:tcBorders>
               <w:top w:val="single" w:sz="4" w:space="0" w:color="8C8C8C"/>
               <w:left w:val="single" w:sz="4" w:space="0" w:color="8C8C8C"/>
@@ -9280,7 +9306,7 @@
         </w:tc>
         <w:tc>
           <w:tcPr>
-            <w:tcW w:type="dxa" w:w="915"/>
+            <w:tcW w:type="dxa" w:w="879"/>
             <w:tcBorders>
               <w:top w:val="single" w:sz="4" w:space="0" w:color="8C8C8C"/>
               <w:left w:val="single" w:sz="4" w:space="0" w:color="8C8C8C"/>
@@ -9308,7 +9334,7 @@
         </w:tc>
         <w:tc>
           <w:tcPr>
-            <w:tcW w:type="dxa" w:w="915"/>
+            <w:tcW w:type="dxa" w:w="1206"/>
             <w:tcBorders>
               <w:top w:val="single" w:sz="4" w:space="0" w:color="8C8C8C"/>
               <w:left w:val="single" w:sz="4" w:space="0" w:color="8C8C8C"/>
@@ -9336,7 +9362,7 @@
         </w:tc>
         <w:tc>
           <w:tcPr>
-            <w:tcW w:type="dxa" w:w="4159"/>
+            <w:tcW w:type="dxa" w:w="3995"/>
             <w:tcBorders>
               <w:top w:val="single" w:sz="4" w:space="0" w:color="8C8C8C"/>
               <w:left w:val="single" w:sz="4" w:space="0" w:color="8C8C8C"/>
@@ -9366,7 +9392,7 @@
       <w:tr>
         <w:tc>
           <w:tcPr>
-            <w:tcW w:type="dxa" w:w="915"/>
+            <w:tcW w:type="dxa" w:w="909"/>
             <w:tcBorders>
               <w:top w:val="single" w:sz="4" w:space="0" w:color="8C8C8C"/>
               <w:left w:val="single" w:sz="4" w:space="0" w:color="8C8C8C"/>
@@ -9394,7 +9420,7 @@
         </w:tc>
         <w:tc>
           <w:tcPr>
-            <w:tcW w:type="dxa" w:w="2121"/>
+            <w:tcW w:type="dxa" w:w="2037"/>
             <w:tcBorders>
               <w:top w:val="single" w:sz="4" w:space="0" w:color="8C8C8C"/>
               <w:left w:val="single" w:sz="4" w:space="0" w:color="8C8C8C"/>
@@ -9422,7 +9448,7 @@
         </w:tc>
         <w:tc>
           <w:tcPr>
-            <w:tcW w:type="dxa" w:w="915"/>
+            <w:tcW w:type="dxa" w:w="879"/>
             <w:tcBorders>
               <w:top w:val="single" w:sz="4" w:space="0" w:color="8C8C8C"/>
               <w:left w:val="single" w:sz="4" w:space="0" w:color="8C8C8C"/>
@@ -9450,7 +9476,7 @@
         </w:tc>
         <w:tc>
           <w:tcPr>
-            <w:tcW w:type="dxa" w:w="915"/>
+            <w:tcW w:type="dxa" w:w="1206"/>
             <w:tcBorders>
               <w:top w:val="single" w:sz="4" w:space="0" w:color="8C8C8C"/>
               <w:left w:val="single" w:sz="4" w:space="0" w:color="8C8C8C"/>
@@ -9478,7 +9504,7 @@
         </w:tc>
         <w:tc>
           <w:tcPr>
-            <w:tcW w:type="dxa" w:w="4159"/>
+            <w:tcW w:type="dxa" w:w="3995"/>
             <w:tcBorders>
               <w:top w:val="single" w:sz="4" w:space="0" w:color="8C8C8C"/>
               <w:left w:val="single" w:sz="4" w:space="0" w:color="8C8C8C"/>
@@ -9508,7 +9534,7 @@
       <w:tr>
         <w:tc>
           <w:tcPr>
-            <w:tcW w:type="dxa" w:w="915"/>
+            <w:tcW w:type="dxa" w:w="909"/>
             <w:tcBorders>
               <w:top w:val="single" w:sz="4" w:space="0" w:color="8C8C8C"/>
               <w:left w:val="single" w:sz="4" w:space="0" w:color="8C8C8C"/>
@@ -9536,7 +9562,7 @@
         </w:tc>
         <w:tc>
           <w:tcPr>
-            <w:tcW w:type="dxa" w:w="2121"/>
+            <w:tcW w:type="dxa" w:w="2037"/>
             <w:tcBorders>
               <w:top w:val="single" w:sz="4" w:space="0" w:color="8C8C8C"/>
               <w:left w:val="single" w:sz="4" w:space="0" w:color="8C8C8C"/>
@@ -9564,7 +9590,7 @@
         </w:tc>
         <w:tc>
           <w:tcPr>
-            <w:tcW w:type="dxa" w:w="915"/>
+            <w:tcW w:type="dxa" w:w="879"/>
             <w:tcBorders>
               <w:top w:val="single" w:sz="4" w:space="0" w:color="8C8C8C"/>
               <w:left w:val="single" w:sz="4" w:space="0" w:color="8C8C8C"/>
@@ -9592,7 +9618,7 @@
         </w:tc>
         <w:tc>
           <w:tcPr>
-            <w:tcW w:type="dxa" w:w="915"/>
+            <w:tcW w:type="dxa" w:w="1206"/>
             <w:tcBorders>
               <w:top w:val="single" w:sz="4" w:space="0" w:color="8C8C8C"/>
               <w:left w:val="single" w:sz="4" w:space="0" w:color="8C8C8C"/>
@@ -9620,7 +9646,7 @@
         </w:tc>
         <w:tc>
           <w:tcPr>
-            <w:tcW w:type="dxa" w:w="4159"/>
+            <w:tcW w:type="dxa" w:w="3995"/>
             <w:tcBorders>
               <w:top w:val="single" w:sz="4" w:space="0" w:color="8C8C8C"/>
               <w:left w:val="single" w:sz="4" w:space="0" w:color="8C8C8C"/>
@@ -9657,7 +9683,7 @@
       <w:tr>
         <w:tc>
           <w:tcPr>
-            <w:tcW w:type="dxa" w:w="915"/>
+            <w:tcW w:type="dxa" w:w="909"/>
             <w:tcBorders>
               <w:top w:val="single" w:sz="4" w:space="0" w:color="8C8C8C"/>
               <w:left w:val="single" w:sz="4" w:space="0" w:color="8C8C8C"/>
@@ -9685,7 +9711,7 @@
         </w:tc>
         <w:tc>
           <w:tcPr>
-            <w:tcW w:type="dxa" w:w="2121"/>
+            <w:tcW w:type="dxa" w:w="2037"/>
             <w:tcBorders>
               <w:top w:val="single" w:sz="4" w:space="0" w:color="8C8C8C"/>
               <w:left w:val="single" w:sz="4" w:space="0" w:color="8C8C8C"/>
@@ -9713,7 +9739,7 @@
         </w:tc>
         <w:tc>
           <w:tcPr>
-            <w:tcW w:type="dxa" w:w="915"/>
+            <w:tcW w:type="dxa" w:w="879"/>
             <w:tcBorders>
               <w:top w:val="single" w:sz="4" w:space="0" w:color="8C8C8C"/>
               <w:left w:val="single" w:sz="4" w:space="0" w:color="8C8C8C"/>
@@ -9741,7 +9767,7 @@
         </w:tc>
         <w:tc>
           <w:tcPr>
-            <w:tcW w:type="dxa" w:w="915"/>
+            <w:tcW w:type="dxa" w:w="1206"/>
             <w:tcBorders>
               <w:top w:val="single" w:sz="4" w:space="0" w:color="8C8C8C"/>
               <w:left w:val="single" w:sz="4" w:space="0" w:color="8C8C8C"/>
@@ -9769,7 +9795,7 @@
         </w:tc>
         <w:tc>
           <w:tcPr>
-            <w:tcW w:type="dxa" w:w="4159"/>
+            <w:tcW w:type="dxa" w:w="3995"/>
             <w:tcBorders>
               <w:top w:val="single" w:sz="4" w:space="0" w:color="8C8C8C"/>
               <w:left w:val="single" w:sz="4" w:space="0" w:color="8C8C8C"/>

</xml_diff>

<commit_message>
docs(std): repeat 3.6 and 3.8 on macOS; close GER-033/K3 and SDD T10
Run docs/std/v0.3.1/run_std_gui_36_38.py on macOS 27.0 (Python 3.11.16,
develop 9c31c27). All status texts and the 10 batch rows match the
Windows run; only paths and timings differ. With the Windows repeat in
#39, every STD case (3.1-3.9) has now run on both platforms.

- docs/std/v0.3.1/macos/: screenshots, results_36_38.json (local path
  replaced), 3.6-pytest.log
- STD 1.2: all cases run on both platforms; 4.1 records the macOS repeat
  and notes that the cross test for 3.6/3.8 is the Windows run
- Requirements report v2: GER-033 verification updated, removed from
  section 4.2, K2 and K3 marked closed
- SDD section 9: T10 closed
- Word files regenerated with docs/tools/md_to_docx.py (same cover
  arguments; only the edited text differs)
</commit_message>
<xml_diff>
--- a/docs/TestZede-Gereksinim-Raporu-v2.docx
+++ b/docs/TestZede-Gereksinim-Raporu-v2.docx
@@ -6398,7 +6398,7 @@
               <w:rPr>
                 <w:sz w:val="18"/>
               </w:rPr>
-              <w:t>CI (Windows ve macOS); STD 1.2 (bkz. §4.2)</w:t>
+              <w:t>CI (Windows ve macOS); STD 3.1–3.9 her iki platformda (STD 1.2, 4.1)</w:t>
             </w:r>
           </w:p>
         </w:tc>
@@ -13793,14 +13793,14 @@
         <w:tblLayout w:type="fixed"/>
       </w:tblPr>
       <w:tblGrid>
-        <w:gridCol w:w="3035"/>
-        <w:gridCol w:w="1080"/>
-        <w:gridCol w:w="4911"/>
+        <w:gridCol w:w="3084"/>
+        <w:gridCol w:w="1071"/>
+        <w:gridCol w:w="4870"/>
       </w:tblGrid>
       <w:tr>
         <w:tc>
           <w:tcPr>
-            <w:tcW w:type="dxa" w:w="3035"/>
+            <w:tcW w:type="dxa" w:w="3084"/>
             <w:tcBorders>
               <w:top w:val="single" w:sz="4" w:space="0" w:color="8C8C8C"/>
               <w:left w:val="single" w:sz="4" w:space="0" w:color="8C8C8C"/>
@@ -13830,7 +13830,7 @@
         </w:tc>
         <w:tc>
           <w:tcPr>
-            <w:tcW w:type="dxa" w:w="1080"/>
+            <w:tcW w:type="dxa" w:w="1071"/>
             <w:tcBorders>
               <w:top w:val="single" w:sz="4" w:space="0" w:color="8C8C8C"/>
               <w:left w:val="single" w:sz="4" w:space="0" w:color="8C8C8C"/>
@@ -13860,7 +13860,7 @@
         </w:tc>
         <w:tc>
           <w:tcPr>
-            <w:tcW w:type="dxa" w:w="4911"/>
+            <w:tcW w:type="dxa" w:w="4870"/>
             <w:tcBorders>
               <w:top w:val="single" w:sz="4" w:space="0" w:color="8C8C8C"/>
               <w:left w:val="single" w:sz="4" w:space="0" w:color="8C8C8C"/>
@@ -13892,7 +13892,7 @@
       <w:tr>
         <w:tc>
           <w:tcPr>
-            <w:tcW w:type="dxa" w:w="3035"/>
+            <w:tcW w:type="dxa" w:w="3084"/>
             <w:tcBorders>
               <w:top w:val="single" w:sz="4" w:space="0" w:color="8C8C8C"/>
               <w:left w:val="single" w:sz="4" w:space="0" w:color="8C8C8C"/>
@@ -13920,7 +13920,7 @@
         </w:tc>
         <w:tc>
           <w:tcPr>
-            <w:tcW w:type="dxa" w:w="1080"/>
+            <w:tcW w:type="dxa" w:w="1071"/>
             <w:tcBorders>
               <w:top w:val="single" w:sz="4" w:space="0" w:color="8C8C8C"/>
               <w:left w:val="single" w:sz="4" w:space="0" w:color="8C8C8C"/>
@@ -13948,7 +13948,7 @@
         </w:tc>
         <w:tc>
           <w:tcPr>
-            <w:tcW w:type="dxa" w:w="4911"/>
+            <w:tcW w:type="dxa" w:w="4870"/>
             <w:tcBorders>
               <w:top w:val="single" w:sz="4" w:space="0" w:color="8C8C8C"/>
               <w:left w:val="single" w:sz="4" w:space="0" w:color="8C8C8C"/>
@@ -13978,7 +13978,7 @@
       <w:tr>
         <w:tc>
           <w:tcPr>
-            <w:tcW w:type="dxa" w:w="3035"/>
+            <w:tcW w:type="dxa" w:w="3084"/>
             <w:tcBorders>
               <w:top w:val="single" w:sz="4" w:space="0" w:color="8C8C8C"/>
               <w:left w:val="single" w:sz="4" w:space="0" w:color="8C8C8C"/>
@@ -14006,7 +14006,7 @@
         </w:tc>
         <w:tc>
           <w:tcPr>
-            <w:tcW w:type="dxa" w:w="1080"/>
+            <w:tcW w:type="dxa" w:w="1071"/>
             <w:tcBorders>
               <w:top w:val="single" w:sz="4" w:space="0" w:color="8C8C8C"/>
               <w:left w:val="single" w:sz="4" w:space="0" w:color="8C8C8C"/>
@@ -14034,7 +14034,7 @@
         </w:tc>
         <w:tc>
           <w:tcPr>
-            <w:tcW w:type="dxa" w:w="4911"/>
+            <w:tcW w:type="dxa" w:w="4870"/>
             <w:tcBorders>
               <w:top w:val="single" w:sz="4" w:space="0" w:color="8C8C8C"/>
               <w:left w:val="single" w:sz="4" w:space="0" w:color="8C8C8C"/>
@@ -14064,7 +14064,7 @@
       <w:tr>
         <w:tc>
           <w:tcPr>
-            <w:tcW w:type="dxa" w:w="3035"/>
+            <w:tcW w:type="dxa" w:w="3084"/>
             <w:tcBorders>
               <w:top w:val="single" w:sz="4" w:space="0" w:color="8C8C8C"/>
               <w:left w:val="single" w:sz="4" w:space="0" w:color="8C8C8C"/>
@@ -14092,7 +14092,7 @@
         </w:tc>
         <w:tc>
           <w:tcPr>
-            <w:tcW w:type="dxa" w:w="1080"/>
+            <w:tcW w:type="dxa" w:w="1071"/>
             <w:tcBorders>
               <w:top w:val="single" w:sz="4" w:space="0" w:color="8C8C8C"/>
               <w:left w:val="single" w:sz="4" w:space="0" w:color="8C8C8C"/>
@@ -14120,7 +14120,7 @@
         </w:tc>
         <w:tc>
           <w:tcPr>
-            <w:tcW w:type="dxa" w:w="4911"/>
+            <w:tcW w:type="dxa" w:w="4870"/>
             <w:tcBorders>
               <w:top w:val="single" w:sz="4" w:space="0" w:color="8C8C8C"/>
               <w:left w:val="single" w:sz="4" w:space="0" w:color="8C8C8C"/>
@@ -14163,7 +14163,7 @@
       <w:tr>
         <w:tc>
           <w:tcPr>
-            <w:tcW w:type="dxa" w:w="3035"/>
+            <w:tcW w:type="dxa" w:w="3084"/>
             <w:tcBorders>
               <w:top w:val="single" w:sz="4" w:space="0" w:color="8C8C8C"/>
               <w:left w:val="single" w:sz="4" w:space="0" w:color="8C8C8C"/>
@@ -14191,7 +14191,7 @@
         </w:tc>
         <w:tc>
           <w:tcPr>
-            <w:tcW w:type="dxa" w:w="1080"/>
+            <w:tcW w:type="dxa" w:w="1071"/>
             <w:tcBorders>
               <w:top w:val="single" w:sz="4" w:space="0" w:color="8C8C8C"/>
               <w:left w:val="single" w:sz="4" w:space="0" w:color="8C8C8C"/>
@@ -14219,7 +14219,7 @@
         </w:tc>
         <w:tc>
           <w:tcPr>
-            <w:tcW w:type="dxa" w:w="4911"/>
+            <w:tcW w:type="dxa" w:w="4870"/>
             <w:tcBorders>
               <w:top w:val="single" w:sz="4" w:space="0" w:color="8C8C8C"/>
               <w:left w:val="single" w:sz="4" w:space="0" w:color="8C8C8C"/>
@@ -14249,7 +14249,7 @@
       <w:tr>
         <w:tc>
           <w:tcPr>
-            <w:tcW w:type="dxa" w:w="3035"/>
+            <w:tcW w:type="dxa" w:w="3084"/>
             <w:tcBorders>
               <w:top w:val="single" w:sz="4" w:space="0" w:color="8C8C8C"/>
               <w:left w:val="single" w:sz="4" w:space="0" w:color="8C8C8C"/>
@@ -14277,7 +14277,7 @@
         </w:tc>
         <w:tc>
           <w:tcPr>
-            <w:tcW w:type="dxa" w:w="1080"/>
+            <w:tcW w:type="dxa" w:w="1071"/>
             <w:tcBorders>
               <w:top w:val="single" w:sz="4" w:space="0" w:color="8C8C8C"/>
               <w:left w:val="single" w:sz="4" w:space="0" w:color="8C8C8C"/>
@@ -14305,7 +14305,7 @@
         </w:tc>
         <w:tc>
           <w:tcPr>
-            <w:tcW w:type="dxa" w:w="4911"/>
+            <w:tcW w:type="dxa" w:w="4870"/>
             <w:tcBorders>
               <w:top w:val="single" w:sz="4" w:space="0" w:color="8C8C8C"/>
               <w:left w:val="single" w:sz="4" w:space="0" w:color="8C8C8C"/>
@@ -14335,7 +14335,7 @@
       <w:tr>
         <w:tc>
           <w:tcPr>
-            <w:tcW w:type="dxa" w:w="3035"/>
+            <w:tcW w:type="dxa" w:w="3084"/>
             <w:tcBorders>
               <w:top w:val="single" w:sz="4" w:space="0" w:color="8C8C8C"/>
               <w:left w:val="single" w:sz="4" w:space="0" w:color="8C8C8C"/>
@@ -14363,7 +14363,7 @@
         </w:tc>
         <w:tc>
           <w:tcPr>
-            <w:tcW w:type="dxa" w:w="1080"/>
+            <w:tcW w:type="dxa" w:w="1071"/>
             <w:tcBorders>
               <w:top w:val="single" w:sz="4" w:space="0" w:color="8C8C8C"/>
               <w:left w:val="single" w:sz="4" w:space="0" w:color="8C8C8C"/>
@@ -14391,7 +14391,7 @@
         </w:tc>
         <w:tc>
           <w:tcPr>
-            <w:tcW w:type="dxa" w:w="4911"/>
+            <w:tcW w:type="dxa" w:w="4870"/>
             <w:tcBorders>
               <w:top w:val="single" w:sz="4" w:space="0" w:color="8C8C8C"/>
               <w:left w:val="single" w:sz="4" w:space="0" w:color="8C8C8C"/>
@@ -14421,7 +14421,7 @@
       <w:tr>
         <w:tc>
           <w:tcPr>
-            <w:tcW w:type="dxa" w:w="3035"/>
+            <w:tcW w:type="dxa" w:w="3084"/>
             <w:tcBorders>
               <w:top w:val="single" w:sz="4" w:space="0" w:color="8C8C8C"/>
               <w:left w:val="single" w:sz="4" w:space="0" w:color="8C8C8C"/>
@@ -14449,7 +14449,7 @@
         </w:tc>
         <w:tc>
           <w:tcPr>
-            <w:tcW w:type="dxa" w:w="1080"/>
+            <w:tcW w:type="dxa" w:w="1071"/>
             <w:tcBorders>
               <w:top w:val="single" w:sz="4" w:space="0" w:color="8C8C8C"/>
               <w:left w:val="single" w:sz="4" w:space="0" w:color="8C8C8C"/>
@@ -14477,7 +14477,7 @@
         </w:tc>
         <w:tc>
           <w:tcPr>
-            <w:tcW w:type="dxa" w:w="4911"/>
+            <w:tcW w:type="dxa" w:w="4870"/>
             <w:tcBorders>
               <w:top w:val="single" w:sz="4" w:space="0" w:color="8C8C8C"/>
               <w:left w:val="single" w:sz="4" w:space="0" w:color="8C8C8C"/>
@@ -14507,7 +14507,7 @@
       <w:tr>
         <w:tc>
           <w:tcPr>
-            <w:tcW w:type="dxa" w:w="3035"/>
+            <w:tcW w:type="dxa" w:w="3084"/>
             <w:tcBorders>
               <w:top w:val="single" w:sz="4" w:space="0" w:color="8C8C8C"/>
               <w:left w:val="single" w:sz="4" w:space="0" w:color="8C8C8C"/>
@@ -14535,7 +14535,7 @@
         </w:tc>
         <w:tc>
           <w:tcPr>
-            <w:tcW w:type="dxa" w:w="1080"/>
+            <w:tcW w:type="dxa" w:w="1071"/>
             <w:tcBorders>
               <w:top w:val="single" w:sz="4" w:space="0" w:color="8C8C8C"/>
               <w:left w:val="single" w:sz="4" w:space="0" w:color="8C8C8C"/>
@@ -14563,7 +14563,7 @@
         </w:tc>
         <w:tc>
           <w:tcPr>
-            <w:tcW w:type="dxa" w:w="4911"/>
+            <w:tcW w:type="dxa" w:w="4870"/>
             <w:tcBorders>
               <w:top w:val="single" w:sz="4" w:space="0" w:color="8C8C8C"/>
               <w:left w:val="single" w:sz="4" w:space="0" w:color="8C8C8C"/>
@@ -14593,93 +14593,7 @@
       <w:tr>
         <w:tc>
           <w:tcPr>
-            <w:tcW w:type="dxa" w:w="3035"/>
-            <w:tcBorders>
-              <w:top w:val="single" w:sz="4" w:space="0" w:color="8C8C8C"/>
-              <w:left w:val="single" w:sz="4" w:space="0" w:color="8C8C8C"/>
-              <w:bottom w:val="single" w:sz="4" w:space="0" w:color="8C8C8C"/>
-              <w:right w:val="single" w:sz="4" w:space="0" w:color="8C8C8C"/>
-            </w:tcBorders>
-            <w:tcMar>
-              <w:top w:w="60" w:type="dxa"/>
-              <w:left w:w="100" w:type="dxa"/>
-              <w:bottom w:w="60" w:type="dxa"/>
-              <w:right w:w="100" w:type="dxa"/>
-            </w:tcMar>
-          </w:tcPr>
-          <w:p>
-            <w:pPr>
-              <w:spacing w:after="0"/>
-            </w:pPr>
-            <w:r>
-              <w:rPr>
-                <w:sz w:val="18"/>
-              </w:rPr>
-              <w:t>GER-033 Windows ve macOS</w:t>
-            </w:r>
-          </w:p>
-        </w:tc>
-        <w:tc>
-          <w:tcPr>
-            <w:tcW w:type="dxa" w:w="1080"/>
-            <w:tcBorders>
-              <w:top w:val="single" w:sz="4" w:space="0" w:color="8C8C8C"/>
-              <w:left w:val="single" w:sz="4" w:space="0" w:color="8C8C8C"/>
-              <w:bottom w:val="single" w:sz="4" w:space="0" w:color="8C8C8C"/>
-              <w:right w:val="single" w:sz="4" w:space="0" w:color="8C8C8C"/>
-            </w:tcBorders>
-            <w:tcMar>
-              <w:top w:w="60" w:type="dxa"/>
-              <w:left w:w="100" w:type="dxa"/>
-              <w:bottom w:w="60" w:type="dxa"/>
-              <w:right w:w="100" w:type="dxa"/>
-            </w:tcMar>
-          </w:tcPr>
-          <w:p>
-            <w:pPr>
-              <w:spacing w:after="0"/>
-            </w:pPr>
-            <w:r>
-              <w:rPr>
-                <w:sz w:val="18"/>
-              </w:rPr>
-              <w:t>Kısmen</w:t>
-            </w:r>
-          </w:p>
-        </w:tc>
-        <w:tc>
-          <w:tcPr>
-            <w:tcW w:type="dxa" w:w="4911"/>
-            <w:tcBorders>
-              <w:top w:val="single" w:sz="4" w:space="0" w:color="8C8C8C"/>
-              <w:left w:val="single" w:sz="4" w:space="0" w:color="8C8C8C"/>
-              <w:bottom w:val="single" w:sz="4" w:space="0" w:color="8C8C8C"/>
-              <w:right w:val="single" w:sz="4" w:space="0" w:color="8C8C8C"/>
-            </w:tcBorders>
-            <w:tcMar>
-              <w:top w:w="60" w:type="dxa"/>
-              <w:left w:w="100" w:type="dxa"/>
-              <w:bottom w:w="60" w:type="dxa"/>
-              <w:right w:w="100" w:type="dxa"/>
-            </w:tcMar>
-          </w:tcPr>
-          <w:p>
-            <w:pPr>
-              <w:spacing w:after="0"/>
-            </w:pPr>
-            <w:r>
-              <w:rPr>
-                <w:sz w:val="18"/>
-              </w:rPr>
-              <w:t>STD 1.2 "iki platformda" der; 4.1'deki test ortamı ve "Test eden" satırına göre her test case tek platformda koşulmuş (3.1–3.5, 3.7, 3.9 macOS; 3.6, 3.8 Windows). CI iki platformda birim testlerini koşar.</w:t>
-            </w:r>
-          </w:p>
-        </w:tc>
-      </w:tr>
-      <w:tr>
-        <w:tc>
-          <w:tcPr>
-            <w:tcW w:type="dxa" w:w="3035"/>
+            <w:tcW w:type="dxa" w:w="3084"/>
             <w:tcBorders>
               <w:top w:val="single" w:sz="4" w:space="0" w:color="8C8C8C"/>
               <w:left w:val="single" w:sz="4" w:space="0" w:color="8C8C8C"/>
@@ -14707,7 +14621,7 @@
         </w:tc>
         <w:tc>
           <w:tcPr>
-            <w:tcW w:type="dxa" w:w="1080"/>
+            <w:tcW w:type="dxa" w:w="1071"/>
             <w:tcBorders>
               <w:top w:val="single" w:sz="4" w:space="0" w:color="8C8C8C"/>
               <w:left w:val="single" w:sz="4" w:space="0" w:color="8C8C8C"/>
@@ -14735,7 +14649,7 @@
         </w:tc>
         <w:tc>
           <w:tcPr>
-            <w:tcW w:type="dxa" w:w="4911"/>
+            <w:tcW w:type="dxa" w:w="4870"/>
             <w:tcBorders>
               <w:top w:val="single" w:sz="4" w:space="0" w:color="8C8C8C"/>
               <w:left w:val="single" w:sz="4" w:space="0" w:color="8C8C8C"/>
@@ -15263,7 +15177,7 @@
         <w:t>pyproject.toml</w:t>
       </w:r>
       <w:r>
-        <w:t>, sözleşme ekleri ve STD'deki farklar açıktır. Bu raporu doğrudan etkileyenler:</w:t>
+        <w:t xml:space="preserve"> ve sözleşme eklerindeki farklar açıktır; STD'deki fark (T10) kapanmıştır. Bu raporu doğrudan etkileyenler:</w:t>
       </w:r>
     </w:p>
     <w:p>
@@ -15346,10 +15260,28 @@
         <w:rPr>
           <w:b/>
         </w:rPr>
-        <w:t>K3 — STD 1.2 "iki platformda" ifadesi.</w:t>
+        <w:t>K3 — STD 1.2 "iki platformda" ifadesi (kapandı).</w:t>
       </w:r>
       <w:r>
-        <w:t xml:space="preserve"> Kabul testi öncesi kalan case'ler ikinci platformda da koşulacak mı, yoksa STD 1.2 mi düzeltilecek (GER-033)?</w:t>
+        <w:t xml:space="preserve"> Eksik case'ler ikinci platformda da koşuldu: 3.1–3.5, 3.7 ve 3.9 Windows'ta (23/10/2026), 3.6 ve 3.8 macOS'ta (24/10/2026). Durum sonuçları iki platformda aynıdır; STD 1.2 ve 4.1 buna göre güncellendi, kanıtlar </w:t>
+      </w:r>
+      <w:r>
+        <w:rPr>
+          <w:rFonts w:ascii="Consolas" w:hAnsi="Consolas"/>
+        </w:rPr>
+        <w:t>docs/std/v0.3.1/windows/</w:t>
+      </w:r>
+      <w:r>
+        <w:t xml:space="preserve"> ve </w:t>
+      </w:r>
+      <w:r>
+        <w:rPr>
+          <w:rFonts w:ascii="Consolas" w:hAnsi="Consolas"/>
+        </w:rPr>
+        <w:t>docs/std/v0.3.1/macos/</w:t>
+      </w:r>
+      <w:r>
+        <w:t xml:space="preserve"> altında (GER-033).</w:t>
       </w:r>
     </w:p>
     <w:p>

</xml_diff>